<commit_message>
docs: rebuild the role manuals at 2.2.0
The schedule chapters now teach the named frequencies with their time
and day, parameters relative to the run date (with worked examples for
last month, year to date, last quarter), several schedules per map, and
"No changes to save" on the builder's Save. CAPABILITIES.md records the
new dialog. Translated into pt-PT, es-ES and fr-FR.

All 123 screenshots per locale re-shot at 2.2.0. The unused Output
Format dropdown shot (user/35) is replaced by the relative-date
parameter shot, so no other number moves.

manual-shots.mjs: the cron preset keys are gone (frequencies.*), option
clicks are exact ("Bimensuel" contains "mensuel"), the schedule Name
field is matched exactly ("Nom" was also "Nombre de périodes"), and
the credentials file path can come from MANUAL_CREDS.

Co-Authored-By: Claude Opus 5.5 <noreply@anthropic.com>
</commit_message>
<xml_diff>
--- a/discoverer-neo/docs/user-guide/manual/Discoverer-Neo-ADMIN-Guide-Quick-en.docx
+++ b/discoverer-neo/docs/user-guide/manual/Discoverer-Neo-ADMIN-Guide-Quick-en.docx
@@ -54,7 +54,7 @@
           <w:sz w:val="22"/>
           <w:szCs w:val="22"/>
         </w:rPr>
-        <w:t>Version 2.1.1</w:t>
+        <w:t>Version 2.2.0</w:t>
       </w:r>
     </w:p>
     <w:p>
@@ -74,7 +74,7 @@
     <w:sdt>
       <w:sdtPr>
         <w:alias w:val="Contents"/>
-        <w:id w:val="-1581450329"/>
+        <w:id w:val="-1142187266"/>
       </w:sdtPr>
       <w:sdtEndPr/>
       <w:sdtContent>
@@ -102,7 +102,7 @@
           <w:r>
             <w:fldChar w:fldCharType="separate"/>
           </w:r>
-          <w:hyperlink w:anchor="_Toc241748046" w:history="1">
+          <w:hyperlink w:anchor="_Toc241848278" w:history="1">
             <w:r>
               <w:rPr>
                 <w:rStyle w:val="Hiperligao"/>
@@ -126,7 +126,7 @@
               <w:rPr>
                 <w:noProof/>
               </w:rPr>
-              <w:instrText xml:space="preserve"> PAGEREF _Toc241748046 \h </w:instrText>
+              <w:instrText xml:space="preserve"> PAGEREF _Toc241848278 \h </w:instrText>
             </w:r>
             <w:r>
               <w:rPr>
@@ -168,7 +168,7 @@
               <w14:ligatures w14:val="standardContextual"/>
             </w:rPr>
           </w:pPr>
-          <w:hyperlink w:anchor="_Toc241748047" w:history="1">
+          <w:hyperlink w:anchor="_Toc241848279" w:history="1">
             <w:r>
               <w:rPr>
                 <w:rStyle w:val="Hiperligao"/>
@@ -192,7 +192,7 @@
               <w:rPr>
                 <w:noProof/>
               </w:rPr>
-              <w:instrText xml:space="preserve"> PAGEREF _Toc241748047 \h </w:instrText>
+              <w:instrText xml:space="preserve"> PAGEREF _Toc241848279 \h </w:instrText>
             </w:r>
             <w:r>
               <w:rPr>
@@ -234,7 +234,7 @@
               <w14:ligatures w14:val="standardContextual"/>
             </w:rPr>
           </w:pPr>
-          <w:hyperlink w:anchor="_Toc241748048" w:history="1">
+          <w:hyperlink w:anchor="_Toc241848280" w:history="1">
             <w:r>
               <w:rPr>
                 <w:rStyle w:val="Hiperligao"/>
@@ -258,7 +258,7 @@
               <w:rPr>
                 <w:noProof/>
               </w:rPr>
-              <w:instrText xml:space="preserve"> PAGEREF _Toc241748048 \h </w:instrText>
+              <w:instrText xml:space="preserve"> PAGEREF _Toc241848280 \h </w:instrText>
             </w:r>
             <w:r>
               <w:rPr>
@@ -300,7 +300,7 @@
               <w14:ligatures w14:val="standardContextual"/>
             </w:rPr>
           </w:pPr>
-          <w:hyperlink w:anchor="_Toc241748049" w:history="1">
+          <w:hyperlink w:anchor="_Toc241848281" w:history="1">
             <w:r>
               <w:rPr>
                 <w:rStyle w:val="Hiperligao"/>
@@ -324,7 +324,7 @@
               <w:rPr>
                 <w:noProof/>
               </w:rPr>
-              <w:instrText xml:space="preserve"> PAGEREF _Toc241748049 \h </w:instrText>
+              <w:instrText xml:space="preserve"> PAGEREF _Toc241848281 \h </w:instrText>
             </w:r>
             <w:r>
               <w:rPr>
@@ -366,7 +366,7 @@
               <w14:ligatures w14:val="standardContextual"/>
             </w:rPr>
           </w:pPr>
-          <w:hyperlink w:anchor="_Toc241748050" w:history="1">
+          <w:hyperlink w:anchor="_Toc241848282" w:history="1">
             <w:r>
               <w:rPr>
                 <w:rStyle w:val="Hiperligao"/>
@@ -390,7 +390,7 @@
               <w:rPr>
                 <w:noProof/>
               </w:rPr>
-              <w:instrText xml:space="preserve"> PAGEREF _Toc241748050 \h </w:instrText>
+              <w:instrText xml:space="preserve"> PAGEREF _Toc241848282 \h </w:instrText>
             </w:r>
             <w:r>
               <w:rPr>
@@ -432,7 +432,7 @@
               <w14:ligatures w14:val="standardContextual"/>
             </w:rPr>
           </w:pPr>
-          <w:hyperlink w:anchor="_Toc241748051" w:history="1">
+          <w:hyperlink w:anchor="_Toc241848283" w:history="1">
             <w:r>
               <w:rPr>
                 <w:rStyle w:val="Hiperligao"/>
@@ -456,7 +456,7 @@
               <w:rPr>
                 <w:noProof/>
               </w:rPr>
-              <w:instrText xml:space="preserve"> PAGEREF _Toc241748051 \h </w:instrText>
+              <w:instrText xml:space="preserve"> PAGEREF _Toc241848283 \h </w:instrText>
             </w:r>
             <w:r>
               <w:rPr>
@@ -498,7 +498,7 @@
               <w14:ligatures w14:val="standardContextual"/>
             </w:rPr>
           </w:pPr>
-          <w:hyperlink w:anchor="_Toc241748052" w:history="1">
+          <w:hyperlink w:anchor="_Toc241848284" w:history="1">
             <w:r>
               <w:rPr>
                 <w:rStyle w:val="Hiperligao"/>
@@ -522,7 +522,7 @@
               <w:rPr>
                 <w:noProof/>
               </w:rPr>
-              <w:instrText xml:space="preserve"> PAGEREF _Toc241748052 \h </w:instrText>
+              <w:instrText xml:space="preserve"> PAGEREF _Toc241848284 \h </w:instrText>
             </w:r>
             <w:r>
               <w:rPr>
@@ -564,7 +564,7 @@
               <w14:ligatures w14:val="standardContextual"/>
             </w:rPr>
           </w:pPr>
-          <w:hyperlink w:anchor="_Toc241748053" w:history="1">
+          <w:hyperlink w:anchor="_Toc241848285" w:history="1">
             <w:r>
               <w:rPr>
                 <w:rStyle w:val="Hiperligao"/>
@@ -588,7 +588,7 @@
               <w:rPr>
                 <w:noProof/>
               </w:rPr>
-              <w:instrText xml:space="preserve"> PAGEREF _Toc241748053 \h </w:instrText>
+              <w:instrText xml:space="preserve"> PAGEREF _Toc241848285 \h </w:instrText>
             </w:r>
             <w:r>
               <w:rPr>
@@ -630,7 +630,7 @@
               <w14:ligatures w14:val="standardContextual"/>
             </w:rPr>
           </w:pPr>
-          <w:hyperlink w:anchor="_Toc241748054" w:history="1">
+          <w:hyperlink w:anchor="_Toc241848286" w:history="1">
             <w:r>
               <w:rPr>
                 <w:rStyle w:val="Hiperligao"/>
@@ -654,7 +654,7 @@
               <w:rPr>
                 <w:noProof/>
               </w:rPr>
-              <w:instrText xml:space="preserve"> PAGEREF _Toc241748054 \h </w:instrText>
+              <w:instrText xml:space="preserve"> PAGEREF _Toc241848286 \h </w:instrText>
             </w:r>
             <w:r>
               <w:rPr>
@@ -696,7 +696,7 @@
               <w14:ligatures w14:val="standardContextual"/>
             </w:rPr>
           </w:pPr>
-          <w:hyperlink w:anchor="_Toc241748055" w:history="1">
+          <w:hyperlink w:anchor="_Toc241848287" w:history="1">
             <w:r>
               <w:rPr>
                 <w:rStyle w:val="Hiperligao"/>
@@ -720,7 +720,7 @@
               <w:rPr>
                 <w:noProof/>
               </w:rPr>
-              <w:instrText xml:space="preserve"> PAGEREF _Toc241748055 \h </w:instrText>
+              <w:instrText xml:space="preserve"> PAGEREF _Toc241848287 \h </w:instrText>
             </w:r>
             <w:r>
               <w:rPr>
@@ -768,7 +768,7 @@
       <w:pPr>
         <w:pStyle w:val="Ttulo1"/>
       </w:pPr>
-      <w:bookmarkStart w:id="0" w:name="_Toc241748046"/>
+      <w:bookmarkStart w:id="0" w:name="_Toc241848278"/>
       <w:r>
         <w:lastRenderedPageBreak/>
         <w:t>Your role in one page</w:t>
@@ -825,7 +825,7 @@
           <w:left w:w="10" w:type="dxa"/>
           <w:right w:w="10" w:type="dxa"/>
         </w:tblCellMar>
-        <w:tblLook w:val="04A0" w:firstRow="1" w:lastRow="0" w:firstColumn="1" w:lastColumn="0" w:noHBand="0" w:noVBand="1"/>
+        <w:tblLook w:val="0000" w:firstRow="0" w:lastRow="0" w:firstColumn="0" w:lastColumn="0" w:noHBand="0" w:noVBand="0"/>
       </w:tblPr>
       <w:tblGrid>
         <w:gridCol w:w="4513"/>
@@ -1415,10 +1415,10 @@
           <w:noProof/>
         </w:rPr>
         <w:drawing>
-          <wp:inline distT="0" distB="0" distL="0" distR="0" wp14:anchorId="61CF9D3F" wp14:editId="74D05585">
+          <wp:inline distT="0" distB="0" distL="0" distR="0" wp14:anchorId="32D151DD" wp14:editId="233E6CD8">
             <wp:extent cx="5715000" cy="3571875"/>
             <wp:effectExtent l="0" t="0" r="0" b="0"/>
-            <wp:docPr id="157" name="01-login.png" descr="The sign-in page with Email, Password, Remember me and the Sign in button." title="The sign-in page with Email, Password, Remember me and the Sign in button."/>
+            <wp:docPr id="161" name="01-login.png" descr="The sign-in page with Email, Password, Remember me and the Sign in button." title="The sign-in page with Email, Password, Remember me and the Sign in button."/>
             <wp:cNvGraphicFramePr>
               <a:graphicFrameLocks xmlns:a="http://schemas.openxmlformats.org/drawingml/2006/main" noChangeAspect="1"/>
             </wp:cNvGraphicFramePr>
@@ -1468,7 +1468,7 @@
         <w:pStyle w:val="Ttulo1"/>
         <w:pageBreakBefore/>
       </w:pPr>
-      <w:bookmarkStart w:id="1" w:name="_Toc241748047"/>
+      <w:bookmarkStart w:id="1" w:name="_Toc241848279"/>
       <w:r>
         <w:lastRenderedPageBreak/>
         <w:t>Dashboard and Maps</w:t>
@@ -1511,10 +1511,10 @@
           <w:noProof/>
         </w:rPr>
         <w:drawing>
-          <wp:inline distT="0" distB="0" distL="0" distR="0" wp14:anchorId="776DD523" wp14:editId="4B968970">
+          <wp:inline distT="0" distB="0" distL="0" distR="0" wp14:anchorId="2CE260FA" wp14:editId="03AF2DBE">
             <wp:extent cx="5715000" cy="3429000"/>
             <wp:effectExtent l="0" t="0" r="0" b="0"/>
-            <wp:docPr id="158" name="02-maps-all.png" descr="The Maps list, All tab, with every row icon and the Workbooks section above." title="The Maps list, All tab, with every row icon and the Workbooks section above."/>
+            <wp:docPr id="162" name="02-maps-all.png" descr="The Maps list, All tab, with every row icon and the Workbooks section above." title="The Maps list, All tab, with every row icon and the Workbooks section above."/>
             <wp:cNvGraphicFramePr>
               <a:graphicFrameLocks xmlns:a="http://schemas.openxmlformats.org/drawingml/2006/main" noChangeAspect="1"/>
             </wp:cNvGraphicFramePr>
@@ -1694,7 +1694,7 @@
           <w:left w:w="10" w:type="dxa"/>
           <w:right w:w="10" w:type="dxa"/>
         </w:tblCellMar>
-        <w:tblLook w:val="04A0" w:firstRow="1" w:lastRow="0" w:firstColumn="1" w:lastColumn="0" w:noHBand="0" w:noVBand="1"/>
+        <w:tblLook w:val="0000" w:firstRow="0" w:lastRow="0" w:firstColumn="0" w:lastColumn="0" w:noHBand="0" w:noVBand="0"/>
       </w:tblPr>
       <w:tblGrid>
         <w:gridCol w:w="4513"/>
@@ -2040,7 +2040,7 @@
         <w:pStyle w:val="Ttulo1"/>
         <w:pageBreakBefore/>
       </w:pPr>
-      <w:bookmarkStart w:id="2" w:name="_Toc241748048"/>
+      <w:bookmarkStart w:id="2" w:name="_Toc241848280"/>
       <w:r>
         <w:lastRenderedPageBreak/>
         <w:t>Map builder and viewer</w:t>
@@ -2063,10 +2063,10 @@
           <w:noProof/>
         </w:rPr>
         <w:drawing>
-          <wp:inline distT="0" distB="0" distL="0" distR="0" wp14:anchorId="692372EA" wp14:editId="0FFC640F">
+          <wp:inline distT="0" distB="0" distL="0" distR="0" wp14:anchorId="727A7A1B" wp14:editId="5FAB64D4">
             <wp:extent cx="5715000" cy="3571875"/>
             <wp:effectExtent l="0" t="0" r="0" b="0"/>
-            <wp:docPr id="159" name="03-viewer-results.png" descr="Run results with the SQL and Plan buttons beside the Excel, CSV and PDF buttons." title="Run results with the SQL and Plan buttons beside the Excel, CSV and PDF buttons."/>
+            <wp:docPr id="163" name="03-viewer-results.png" descr="Run results with the SQL and Plan buttons beside the Excel, CSV and PDF buttons." title="Run results with the SQL and Plan buttons beside the Excel, CSV and PDF buttons."/>
             <wp:cNvGraphicFramePr>
               <a:graphicFrameLocks xmlns:a="http://schemas.openxmlformats.org/drawingml/2006/main" noChangeAspect="1"/>
             </wp:cNvGraphicFramePr>
@@ -2339,7 +2339,7 @@
           <w:left w:w="10" w:type="dxa"/>
           <w:right w:w="10" w:type="dxa"/>
         </w:tblCellMar>
-        <w:tblLook w:val="04A0" w:firstRow="1" w:lastRow="0" w:firstColumn="1" w:lastColumn="0" w:noHBand="0" w:noVBand="1"/>
+        <w:tblLook w:val="0000" w:firstRow="0" w:lastRow="0" w:firstColumn="0" w:lastColumn="0" w:noHBand="0" w:noVBand="0"/>
       </w:tblPr>
       <w:tblGrid>
         <w:gridCol w:w="4513"/>
@@ -2695,7 +2695,7 @@
         <w:pStyle w:val="Ttulo1"/>
         <w:pageBreakBefore/>
       </w:pPr>
-      <w:bookmarkStart w:id="3" w:name="_Toc241748049"/>
+      <w:bookmarkStart w:id="3" w:name="_Toc241848281"/>
       <w:r>
         <w:lastRenderedPageBreak/>
         <w:t>Runs, Exports and Schedules</w:t>
@@ -2748,10 +2748,10 @@
           <w:noProof/>
         </w:rPr>
         <w:drawing>
-          <wp:inline distT="0" distB="0" distL="0" distR="0" wp14:anchorId="60976040" wp14:editId="2A54580F">
+          <wp:inline distT="0" distB="0" distL="0" distR="0" wp14:anchorId="4D47FF24" wp14:editId="5E13F805">
             <wp:extent cx="5715000" cy="3571875"/>
             <wp:effectExtent l="0" t="0" r="0" b="0"/>
-            <wp:docPr id="160" name="04-runs-every-user.png" descr="The Runs page with every user's runs shown." title="The Runs page with every user's runs shown."/>
+            <wp:docPr id="164" name="04-runs-every-user.png" descr="The Runs page with every user's runs shown." title="The Runs page with every user's runs shown."/>
             <wp:cNvGraphicFramePr>
               <a:graphicFrameLocks xmlns:a="http://schemas.openxmlformats.org/drawingml/2006/main" noChangeAspect="1"/>
             </wp:cNvGraphicFramePr>
@@ -3021,7 +3021,7 @@
           <w:left w:w="10" w:type="dxa"/>
           <w:right w:w="10" w:type="dxa"/>
         </w:tblCellMar>
-        <w:tblLook w:val="04A0" w:firstRow="1" w:lastRow="0" w:firstColumn="1" w:lastColumn="0" w:noHBand="0" w:noVBand="1"/>
+        <w:tblLook w:val="0000" w:firstRow="0" w:lastRow="0" w:firstColumn="0" w:lastColumn="0" w:noHBand="0" w:noVBand="0"/>
       </w:tblPr>
       <w:tblGrid>
         <w:gridCol w:w="4513"/>
@@ -3165,7 +3165,7 @@
                 <w:b/>
                 <w:bCs/>
               </w:rPr>
-              <w:t>Daily (midnight)</w:t>
+              <w:t>Daily</w:t>
             </w:r>
             <w:r>
               <w:t xml:space="preserve">, </w:t>
@@ -3175,7 +3175,7 @@
                 <w:b/>
                 <w:bCs/>
               </w:rPr>
-              <w:t>Weekly (Sunday, midnight)</w:t>
+              <w:t>Weekly</w:t>
             </w:r>
             <w:r>
               <w:t xml:space="preserve">, </w:t>
@@ -3185,7 +3185,7 @@
                 <w:b/>
                 <w:bCs/>
               </w:rPr>
-              <w:t>Monthly (1st, midnight)</w:t>
+              <w:t>Fortnightly</w:t>
             </w:r>
             <w:r>
               <w:t xml:space="preserve">, </w:t>
@@ -3195,10 +3195,40 @@
                 <w:b/>
                 <w:bCs/>
               </w:rPr>
-              <w:t>Custom</w:t>
-            </w:r>
-            <w:r>
-              <w:t xml:space="preserve"> (cron).</w:t>
+              <w:t>Monthly</w:t>
+            </w:r>
+            <w:r>
+              <w:t xml:space="preserve">, every 2, 3, 4 or 6 months, </w:t>
+            </w:r>
+            <w:r>
+              <w:rPr>
+                <w:b/>
+                <w:bCs/>
+              </w:rPr>
+              <w:t>Yearly</w:t>
+            </w:r>
+            <w:r>
+              <w:t xml:space="preserve">, </w:t>
+            </w:r>
+            <w:r>
+              <w:rPr>
+                <w:b/>
+                <w:bCs/>
+              </w:rPr>
+              <w:t>Custom (cron)</w:t>
+            </w:r>
+            <w:r>
+              <w:t xml:space="preserve">. Then a </w:t>
+            </w:r>
+            <w:r>
+              <w:rPr>
+                <w:b/>
+                <w:bCs/>
+              </w:rPr>
+              <w:t>Time</w:t>
+            </w:r>
+            <w:r>
+              <w:t xml:space="preserve"> and a day.</w:t>
             </w:r>
           </w:p>
         </w:tc>
@@ -3239,7 +3269,7 @@
                 <w:b/>
                 <w:bCs/>
               </w:rPr>
-              <w:t>Output Format</w:t>
+              <w:t>Parameter presets</w:t>
             </w:r>
           </w:p>
         </w:tc>
@@ -3269,20 +3299,40 @@
                 <w:b/>
                 <w:bCs/>
               </w:rPr>
-              <w:t>Excel (.xlsx)</w:t>
-            </w:r>
-            <w:r>
-              <w:t xml:space="preserve"> or </w:t>
+              <w:t>Fixed value</w:t>
+            </w:r>
+            <w:r>
+              <w:t xml:space="preserve">, or </w:t>
             </w:r>
             <w:r>
               <w:rPr>
                 <w:b/>
                 <w:bCs/>
               </w:rPr>
-              <w:t>CSV</w:t>
-            </w:r>
-            <w:r>
-              <w:t>.</w:t>
+              <w:t>Relative to the run date</w:t>
+            </w:r>
+            <w:r>
+              <w:t xml:space="preserve"> (for example -1 </w:t>
+            </w:r>
+            <w:r>
+              <w:rPr>
+                <w:b/>
+                <w:bCs/>
+              </w:rPr>
+              <w:t>months</w:t>
+            </w:r>
+            <w:r>
+              <w:t xml:space="preserve">, </w:t>
+            </w:r>
+            <w:r>
+              <w:rPr>
+                <w:b/>
+                <w:bCs/>
+              </w:rPr>
+              <w:t>last day of that month</w:t>
+            </w:r>
+            <w:r>
+              <w:t>).</w:t>
             </w:r>
           </w:p>
         </w:tc>
@@ -3322,6 +3372,89 @@
                 <w:b/>
                 <w:bCs/>
               </w:rPr>
+              <w:t>Output Format</w:t>
+            </w:r>
+          </w:p>
+        </w:tc>
+        <w:tc>
+          <w:tcPr>
+            <w:tcW w:w="4513" w:type="dxa"/>
+            <w:tcBorders>
+              <w:top w:val="single" w:sz="4" w:space="0" w:color="BFC7D1"/>
+              <w:left w:val="single" w:sz="4" w:space="0" w:color="BFC7D1"/>
+              <w:bottom w:val="single" w:sz="4" w:space="0" w:color="BFC7D1"/>
+              <w:right w:val="single" w:sz="4" w:space="0" w:color="BFC7D1"/>
+            </w:tcBorders>
+            <w:tcMar>
+              <w:top w:w="60" w:type="dxa"/>
+              <w:left w:w="100" w:type="dxa"/>
+              <w:bottom w:w="60" w:type="dxa"/>
+              <w:right w:w="100" w:type="dxa"/>
+            </w:tcMar>
+          </w:tcPr>
+          <w:p>
+            <w:pPr>
+              <w:spacing w:after="0"/>
+            </w:pPr>
+            <w:r>
+              <w:rPr>
+                <w:b/>
+                <w:bCs/>
+              </w:rPr>
+              <w:t>Excel (.xlsx)</w:t>
+            </w:r>
+            <w:r>
+              <w:t xml:space="preserve"> or </w:t>
+            </w:r>
+            <w:r>
+              <w:rPr>
+                <w:b/>
+                <w:bCs/>
+              </w:rPr>
+              <w:t>CSV</w:t>
+            </w:r>
+            <w:r>
+              <w:t>.</w:t>
+            </w:r>
+          </w:p>
+        </w:tc>
+      </w:tr>
+      <w:tr>
+        <w:tblPrEx>
+          <w:tblCellMar>
+            <w:top w:w="0" w:type="dxa"/>
+            <w:bottom w:w="0" w:type="dxa"/>
+          </w:tblCellMar>
+        </w:tblPrEx>
+        <w:trPr>
+          <w:cantSplit/>
+        </w:trPr>
+        <w:tc>
+          <w:tcPr>
+            <w:tcW w:w="4513" w:type="dxa"/>
+            <w:tcBorders>
+              <w:top w:val="single" w:sz="4" w:space="0" w:color="BFC7D1"/>
+              <w:left w:val="single" w:sz="4" w:space="0" w:color="BFC7D1"/>
+              <w:bottom w:val="single" w:sz="4" w:space="0" w:color="BFC7D1"/>
+              <w:right w:val="single" w:sz="4" w:space="0" w:color="BFC7D1"/>
+            </w:tcBorders>
+            <w:shd w:val="clear" w:color="auto" w:fill="F3F6F9"/>
+            <w:tcMar>
+              <w:top w:w="60" w:type="dxa"/>
+              <w:left w:w="100" w:type="dxa"/>
+              <w:bottom w:w="60" w:type="dxa"/>
+              <w:right w:w="100" w:type="dxa"/>
+            </w:tcMar>
+          </w:tcPr>
+          <w:p>
+            <w:pPr>
+              <w:spacing w:after="0"/>
+            </w:pPr>
+            <w:r>
+              <w:rPr>
+                <w:b/>
+                <w:bCs/>
+              </w:rPr>
               <w:t>Run now</w:t>
             </w:r>
           </w:p>
@@ -3335,6 +3468,7 @@
               <w:bottom w:val="single" w:sz="4" w:space="0" w:color="BFC7D1"/>
               <w:right w:val="single" w:sz="4" w:space="0" w:color="BFC7D1"/>
             </w:tcBorders>
+            <w:shd w:val="clear" w:color="auto" w:fill="F3F6F9"/>
             <w:tcMar>
               <w:top w:w="60" w:type="dxa"/>
               <w:left w:w="100" w:type="dxa"/>
@@ -3358,7 +3492,7 @@
         <w:pStyle w:val="Ttulo1"/>
         <w:pageBreakBefore/>
       </w:pPr>
-      <w:bookmarkStart w:id="4" w:name="_Toc241748050"/>
+      <w:bookmarkStart w:id="4" w:name="_Toc241848282"/>
       <w:r>
         <w:lastRenderedPageBreak/>
         <w:t>Business Areas and Grants</w:t>
@@ -3391,10 +3525,10 @@
           <w:noProof/>
         </w:rPr>
         <w:drawing>
-          <wp:inline distT="0" distB="0" distL="0" distR="0" wp14:anchorId="00C30501" wp14:editId="54A3AAC3">
+          <wp:inline distT="0" distB="0" distL="0" distR="0" wp14:anchorId="3F1EBFE4" wp14:editId="19B47322">
             <wp:extent cx="5715000" cy="3571875"/>
             <wp:effectExtent l="0" t="0" r="0" b="0"/>
-            <wp:docPr id="161" name="09-business-areas-grants-permission.png" descr="The Manage grants dialog with the Permission list open." title="The Manage grants dialog with the Permission list open."/>
+            <wp:docPr id="165" name="09-business-areas-grants-permission.png" descr="The Manage grants dialog with the Permission list open." title="The Manage grants dialog with the Permission list open."/>
             <wp:cNvGraphicFramePr>
               <a:graphicFrameLocks xmlns:a="http://schemas.openxmlformats.org/drawingml/2006/main" noChangeAspect="1"/>
             </wp:cNvGraphicFramePr>
@@ -3591,7 +3725,7 @@
           <w:left w:w="10" w:type="dxa"/>
           <w:right w:w="10" w:type="dxa"/>
         </w:tblCellMar>
-        <w:tblLook w:val="04A0" w:firstRow="1" w:lastRow="0" w:firstColumn="1" w:lastColumn="0" w:noHBand="0" w:noVBand="1"/>
+        <w:tblLook w:val="0000" w:firstRow="0" w:lastRow="0" w:firstColumn="0" w:lastColumn="0" w:noHBand="0" w:noVBand="0"/>
       </w:tblPr>
       <w:tblGrid>
         <w:gridCol w:w="4513"/>
@@ -3996,7 +4130,7 @@
         <w:pStyle w:val="Ttulo1"/>
         <w:pageBreakBefore/>
       </w:pPr>
-      <w:bookmarkStart w:id="5" w:name="_Toc241748051"/>
+      <w:bookmarkStart w:id="5" w:name="_Toc241848283"/>
       <w:r>
         <w:lastRenderedPageBreak/>
         <w:t>Folders, Items, Joins, Hierarchies</w:t>
@@ -4059,10 +4193,10 @@
           <w:noProof/>
         </w:rPr>
         <w:drawing>
-          <wp:inline distT="0" distB="0" distL="0" distR="0" wp14:anchorId="25DAEBE9" wp14:editId="5A990C41">
+          <wp:inline distT="0" distB="0" distL="0" distR="0" wp14:anchorId="3AB1A902" wp14:editId="4CAD7A68">
             <wp:extent cx="2495550" cy="5905500"/>
             <wp:effectExtent l="0" t="0" r="0" b="0"/>
-            <wp:docPr id="162" name="14-folders-discovered.png" descr="The New Folder dialog after Discover Tables, listing the tables found." title="The New Folder dialog after Discover Tables, listing the tables found."/>
+            <wp:docPr id="166" name="14-folders-discovered.png" descr="The New Folder dialog after Discover Tables, listing the tables found." title="The New Folder dialog after Discover Tables, listing the tables found."/>
             <wp:cNvGraphicFramePr>
               <a:graphicFrameLocks xmlns:a="http://schemas.openxmlformats.org/drawingml/2006/main" noChangeAspect="1"/>
             </wp:cNvGraphicFramePr>
@@ -4345,7 +4479,7 @@
           <w:left w:w="10" w:type="dxa"/>
           <w:right w:w="10" w:type="dxa"/>
         </w:tblCellMar>
-        <w:tblLook w:val="04A0" w:firstRow="1" w:lastRow="0" w:firstColumn="1" w:lastColumn="0" w:noHBand="0" w:noVBand="1"/>
+        <w:tblLook w:val="0000" w:firstRow="0" w:lastRow="0" w:firstColumn="0" w:lastColumn="0" w:noHBand="0" w:noVBand="0"/>
       </w:tblPr>
       <w:tblGrid>
         <w:gridCol w:w="4513"/>
@@ -4629,7 +4763,7 @@
         <w:pStyle w:val="Ttulo1"/>
         <w:pageBreakBefore/>
       </w:pPr>
-      <w:bookmarkStart w:id="6" w:name="_Toc241748052"/>
+      <w:bookmarkStart w:id="6" w:name="_Toc241848284"/>
       <w:r>
         <w:lastRenderedPageBreak/>
         <w:t>Custom Functions and Data Sources</w:t>
@@ -4672,10 +4806,10 @@
           <w:noProof/>
         </w:rPr>
         <w:drawing>
-          <wp:inline distT="0" distB="0" distL="0" distR="0" wp14:anchorId="3C7805CF" wp14:editId="6383BB20">
+          <wp:inline distT="0" distB="0" distL="0" distR="0" wp14:anchorId="363DC8F7" wp14:editId="7B5375C2">
             <wp:extent cx="5715000" cy="3571875"/>
             <wp:effectExtent l="0" t="0" r="0" b="0"/>
-            <wp:docPr id="163" name="30-data-sources.png" descr="The Data Sources page with a table of connections and five row icons." title="The Data Sources page with a table of connections and five row icons."/>
+            <wp:docPr id="167" name="30-data-sources.png" descr="The Data Sources page with a table of connections and five row icons." title="The Data Sources page with a table of connections and five row icons."/>
             <wp:cNvGraphicFramePr>
               <a:graphicFrameLocks xmlns:a="http://schemas.openxmlformats.org/drawingml/2006/main" noChangeAspect="1"/>
             </wp:cNvGraphicFramePr>
@@ -4932,7 +5066,7 @@
           <w:left w:w="10" w:type="dxa"/>
           <w:right w:w="10" w:type="dxa"/>
         </w:tblCellMar>
-        <w:tblLook w:val="04A0" w:firstRow="1" w:lastRow="0" w:firstColumn="1" w:lastColumn="0" w:noHBand="0" w:noVBand="1"/>
+        <w:tblLook w:val="0000" w:firstRow="0" w:lastRow="0" w:firstColumn="0" w:lastColumn="0" w:noHBand="0" w:noVBand="0"/>
       </w:tblPr>
       <w:tblGrid>
         <w:gridCol w:w="4513"/>
@@ -5232,7 +5366,7 @@
         <w:pStyle w:val="Ttulo1"/>
         <w:pageBreakBefore/>
       </w:pPr>
-      <w:bookmarkStart w:id="7" w:name="_Toc241748053"/>
+      <w:bookmarkStart w:id="7" w:name="_Toc241848285"/>
       <w:r>
         <w:lastRenderedPageBreak/>
         <w:t>Users</w:t>
@@ -5255,10 +5389,10 @@
           <w:noProof/>
         </w:rPr>
         <w:drawing>
-          <wp:inline distT="0" distB="0" distL="0" distR="0" wp14:anchorId="4FAEAE2A" wp14:editId="7B5C5E8A">
+          <wp:inline distT="0" distB="0" distL="0" distR="0" wp14:anchorId="4BD97F00" wp14:editId="71E9EFA6">
             <wp:extent cx="5715000" cy="3571875"/>
             <wp:effectExtent l="0" t="0" r="0" b="0"/>
-            <wp:docPr id="164" name="35-users.png" descr="The Users page with the Credentials file and New User buttons and row icons." title="The Users page with the Credentials file and New User buttons and row icons."/>
+            <wp:docPr id="168" name="35-users.png" descr="The Users page with the Credentials file and New User buttons and row icons." title="The Users page with the Credentials file and New User buttons and row icons."/>
             <wp:cNvGraphicFramePr>
               <a:graphicFrameLocks xmlns:a="http://schemas.openxmlformats.org/drawingml/2006/main" noChangeAspect="1"/>
             </wp:cNvGraphicFramePr>
@@ -5485,7 +5619,7 @@
           <w:left w:w="10" w:type="dxa"/>
           <w:right w:w="10" w:type="dxa"/>
         </w:tblCellMar>
-        <w:tblLook w:val="04A0" w:firstRow="1" w:lastRow="0" w:firstColumn="1" w:lastColumn="0" w:noHBand="0" w:noVBand="1"/>
+        <w:tblLook w:val="0000" w:firstRow="0" w:lastRow="0" w:firstColumn="0" w:lastColumn="0" w:noHBand="0" w:noVBand="0"/>
       </w:tblPr>
       <w:tblGrid>
         <w:gridCol w:w="4513"/>
@@ -5951,7 +6085,7 @@
         <w:pStyle w:val="Ttulo1"/>
         <w:pageBreakBefore/>
       </w:pPr>
-      <w:bookmarkStart w:id="8" w:name="_Toc241748054"/>
+      <w:bookmarkStart w:id="8" w:name="_Toc241848286"/>
       <w:r>
         <w:lastRenderedPageBreak/>
         <w:t>Security Policies and Audit Log</w:t>
@@ -5994,10 +6128,10 @@
           <w:noProof/>
         </w:rPr>
         <w:drawing>
-          <wp:inline distT="0" distB="0" distL="0" distR="0" wp14:anchorId="21A3D9CF" wp14:editId="25E78F7A">
+          <wp:inline distT="0" distB="0" distL="0" distR="0" wp14:anchorId="369BAC8A" wp14:editId="0D370014">
             <wp:extent cx="3324225" cy="4638675"/>
             <wp:effectExtent l="0" t="0" r="0" b="0"/>
-            <wp:docPr id="165" name="44-security-new-dialog.png" descr="The New Policy dialog with a name, description and one rule." title="The New Policy dialog with a name, description and one rule."/>
+            <wp:docPr id="169" name="44-security-new-dialog.png" descr="The New Policy dialog with a name, description and one rule." title="The New Policy dialog with a name, description and one rule."/>
             <wp:cNvGraphicFramePr>
               <a:graphicFrameLocks xmlns:a="http://schemas.openxmlformats.org/drawingml/2006/main" noChangeAspect="1"/>
             </wp:cNvGraphicFramePr>
@@ -6358,7 +6492,7 @@
         <w:pStyle w:val="Ttulo1"/>
         <w:pageBreakBefore/>
       </w:pPr>
-      <w:bookmarkStart w:id="9" w:name="_Toc241748055"/>
+      <w:bookmarkStart w:id="9" w:name="_Toc241848287"/>
       <w:r>
         <w:lastRenderedPageBreak/>
         <w:t>Migration</w:t>
@@ -6388,10 +6522,10 @@
           <w:noProof/>
         </w:rPr>
         <w:drawing>
-          <wp:inline distT="0" distB="0" distL="0" distR="0" wp14:anchorId="3F77F46B" wp14:editId="77E87014">
+          <wp:inline distT="0" distB="0" distL="0" distR="0" wp14:anchorId="120ABFDB" wp14:editId="416EFE10">
             <wp:extent cx="5715000" cy="3571875"/>
             <wp:effectExtent l="0" t="0" r="0" b="0"/>
-            <wp:docPr id="166" name="50-migration.png" descr="The Migration page with the Source card, its buttons and help text." title="The Migration page with the Source card, its buttons and help text."/>
+            <wp:docPr id="170" name="50-migration.png" descr="The Migration page with the Source card, its buttons and help text." title="The Migration page with the Source card, its buttons and help text."/>
             <wp:cNvGraphicFramePr>
               <a:graphicFrameLocks xmlns:a="http://schemas.openxmlformats.org/drawingml/2006/main" noChangeAspect="1"/>
             </wp:cNvGraphicFramePr>
@@ -6644,7 +6778,7 @@
           <w:left w:w="10" w:type="dxa"/>
           <w:right w:w="10" w:type="dxa"/>
         </w:tblCellMar>
-        <w:tblLook w:val="04A0" w:firstRow="1" w:lastRow="0" w:firstColumn="1" w:lastColumn="0" w:noHBand="0" w:noVBand="1"/>
+        <w:tblLook w:val="0000" w:firstRow="0" w:lastRow="0" w:firstColumn="0" w:lastColumn="0" w:noHBand="0" w:noVBand="0"/>
       </w:tblPr>
       <w:tblGrid>
         <w:gridCol w:w="4513"/>
@@ -7081,7 +7215,7 @@
         <w:sz w:val="16"/>
         <w:szCs w:val="16"/>
       </w:rPr>
-      <w:t>Discoverer Neo 2.1.1 · Quick guide · ADMIN</w:t>
+      <w:t>Discoverer Neo 2.2.0 · Quick guide · ADMIN</w:t>
     </w:r>
   </w:p>
 </w:hdr>
@@ -7090,10 +7224,68 @@
 <file path=word/numbering.xml><?xml version="1.0" encoding="utf-8"?>
 <w:numbering xmlns:wpc="http://schemas.microsoft.com/office/word/2010/wordprocessingCanvas" xmlns:cx="http://schemas.microsoft.com/office/drawing/2014/chartex" xmlns:cx1="http://schemas.microsoft.com/office/drawing/2015/9/8/chartex" xmlns:cx2="http://schemas.microsoft.com/office/drawing/2015/10/21/chartex" xmlns:cx3="http://schemas.microsoft.com/office/drawing/2016/5/9/chartex" xmlns:cx4="http://schemas.microsoft.com/office/drawing/2016/5/10/chartex" xmlns:cx5="http://schemas.microsoft.com/office/drawing/2016/5/11/chartex" xmlns:cx6="http://schemas.microsoft.com/office/drawing/2016/5/12/chartex" xmlns:cx7="http://schemas.microsoft.com/office/drawing/2016/5/13/chartex" xmlns:cx8="http://schemas.microsoft.com/office/drawing/2016/5/14/chartex" xmlns:mc="http://schemas.openxmlformats.org/markup-compatibility/2006" xmlns:aink="http://schemas.microsoft.com/office/drawing/2016/ink" xmlns:am3d="http://schemas.microsoft.com/office/drawing/2017/model3d" xmlns:o="urn:schemas-microsoft-com:office:office" xmlns:oel="http://schemas.microsoft.com/office/2019/extlst" xmlns:r="http://schemas.openxmlformats.org/officeDocument/2006/relationships" xmlns:m="http://schemas.openxmlformats.org/officeDocument/2006/math" xmlns:v="urn:schemas-microsoft-com:vml" xmlns:wp14="http://schemas.microsoft.com/office/word/2010/wordprocessingDrawing" xmlns:wp="http://schemas.openxmlformats.org/drawingml/2006/wordprocessingDrawing" xmlns:w10="urn:schemas-microsoft-com:office:word" xmlns:w="http://schemas.openxmlformats.org/wordprocessingml/2006/main" xmlns:w14="http://schemas.microsoft.com/office/word/2010/wordml" xmlns:w15="http://schemas.microsoft.com/office/word/2012/wordml" xmlns:w16cex="http://schemas.microsoft.com/office/word/2018/wordml/cex" xmlns:w16cid="http://schemas.microsoft.com/office/word/2016/wordml/cid" xmlns:w16="http://schemas.microsoft.com/office/word/2018/wordml" xmlns:w16sdtdh="http://schemas.microsoft.com/office/word/2020/wordml/sdtdatahash" xmlns:w16se="http://schemas.microsoft.com/office/word/2015/wordml/symex" xmlns:wpg="http://schemas.microsoft.com/office/word/2010/wordprocessingGroup" xmlns:wpi="http://schemas.microsoft.com/office/word/2010/wordprocessingInk" xmlns:wne="http://schemas.microsoft.com/office/word/2006/wordml" xmlns:wps="http://schemas.microsoft.com/office/word/2010/wordprocessingShape" mc:Ignorable="w14 w15 w16se w16cid w16 w16cex w16sdtdh wp14">
   <w:abstractNum w:abstractNumId="0" w15:restartNumberingAfterBreak="0">
-    <w:nsid w:val="074B7089"/>
+    <w:nsid w:val="0D4C47E7"/>
     <w:multiLevelType w:val="hybridMultilevel"/>
-    <w:tmpl w:val="1CCC0A04"/>
-    <w:lvl w:ilvl="0" w:tplc="A0DED7C6">
+    <w:tmpl w:val="5AC83BB8"/>
+    <w:lvl w:ilvl="0" w:tplc="53BCDDB8" w:tentative="1">
+      <w:start w:val="1"/>
+      <w:numFmt w:val="bullet"/>
+      <w:lvlText w:val="•"/>
+      <w:lvlJc w:val="left"/>
+      <w:pPr>
+        <w:ind w:left="360" w:hanging="260"/>
+      </w:pPr>
+    </w:lvl>
+    <w:lvl w:ilvl="1" w:tplc="798ED1C8" w:tentative="1">
+      <w:start w:val="1"/>
+      <w:numFmt w:val="bullet"/>
+      <w:lvlText w:val="–"/>
+      <w:lvlJc w:val="left"/>
+      <w:pPr>
+        <w:ind w:left="720" w:hanging="260"/>
+      </w:pPr>
+    </w:lvl>
+    <w:lvl w:ilvl="2" w:tplc="6E263988">
+      <w:numFmt w:val="decimal"/>
+      <w:lvlText w:val=""/>
+      <w:lvlJc w:val="left"/>
+    </w:lvl>
+    <w:lvl w:ilvl="3" w:tplc="9F5C2468">
+      <w:numFmt w:val="decimal"/>
+      <w:lvlText w:val=""/>
+      <w:lvlJc w:val="left"/>
+    </w:lvl>
+    <w:lvl w:ilvl="4" w:tplc="21843F6A">
+      <w:numFmt w:val="decimal"/>
+      <w:lvlText w:val=""/>
+      <w:lvlJc w:val="left"/>
+    </w:lvl>
+    <w:lvl w:ilvl="5" w:tplc="177C74EA">
+      <w:numFmt w:val="decimal"/>
+      <w:lvlText w:val=""/>
+      <w:lvlJc w:val="left"/>
+    </w:lvl>
+    <w:lvl w:ilvl="6" w:tplc="9A427124">
+      <w:numFmt w:val="decimal"/>
+      <w:lvlText w:val=""/>
+      <w:lvlJc w:val="left"/>
+    </w:lvl>
+    <w:lvl w:ilvl="7" w:tplc="E80CCCEC">
+      <w:numFmt w:val="decimal"/>
+      <w:lvlText w:val=""/>
+      <w:lvlJc w:val="left"/>
+    </w:lvl>
+    <w:lvl w:ilvl="8" w:tplc="12E67056">
+      <w:numFmt w:val="decimal"/>
+      <w:lvlText w:val=""/>
+      <w:lvlJc w:val="left"/>
+    </w:lvl>
+  </w:abstractNum>
+  <w:abstractNum w:abstractNumId="1" w15:restartNumberingAfterBreak="0">
+    <w:nsid w:val="18360AAB"/>
+    <w:multiLevelType w:val="hybridMultilevel"/>
+    <w:tmpl w:val="09102698"/>
+    <w:lvl w:ilvl="0" w:tplc="03400244">
       <w:start w:val="1"/>
       <w:numFmt w:val="decimal"/>
       <w:lvlText w:val="%1."/>
@@ -7102,7 +7294,7 @@
         <w:ind w:left="360" w:hanging="300"/>
       </w:pPr>
     </w:lvl>
-    <w:lvl w:ilvl="1" w:tplc="8250C2B6" w:tentative="1">
+    <w:lvl w:ilvl="1" w:tplc="4EFA5D1A" w:tentative="1">
       <w:start w:val="1"/>
       <w:numFmt w:val="lowerLetter"/>
       <w:lvlText w:val="%2."/>
@@ -7111,47 +7303,511 @@
         <w:ind w:left="720" w:hanging="300"/>
       </w:pPr>
     </w:lvl>
-    <w:lvl w:ilvl="2" w:tplc="495258DE">
+    <w:lvl w:ilvl="2" w:tplc="48FC7600">
       <w:numFmt w:val="decimal"/>
       <w:lvlText w:val=""/>
       <w:lvlJc w:val="left"/>
     </w:lvl>
-    <w:lvl w:ilvl="3" w:tplc="BA98DDCC">
+    <w:lvl w:ilvl="3" w:tplc="7952DF7A">
       <w:numFmt w:val="decimal"/>
       <w:lvlText w:val=""/>
       <w:lvlJc w:val="left"/>
     </w:lvl>
-    <w:lvl w:ilvl="4" w:tplc="5B96FE3E">
+    <w:lvl w:ilvl="4" w:tplc="CBD0985A">
       <w:numFmt w:val="decimal"/>
       <w:lvlText w:val=""/>
       <w:lvlJc w:val="left"/>
     </w:lvl>
-    <w:lvl w:ilvl="5" w:tplc="54D4B18C">
+    <w:lvl w:ilvl="5" w:tplc="5D5AB836">
       <w:numFmt w:val="decimal"/>
       <w:lvlText w:val=""/>
       <w:lvlJc w:val="left"/>
     </w:lvl>
-    <w:lvl w:ilvl="6" w:tplc="F3E2B436">
+    <w:lvl w:ilvl="6" w:tplc="A12E081A">
       <w:numFmt w:val="decimal"/>
       <w:lvlText w:val=""/>
       <w:lvlJc w:val="left"/>
     </w:lvl>
-    <w:lvl w:ilvl="7" w:tplc="2990F4A6">
+    <w:lvl w:ilvl="7" w:tplc="2E583C3E">
       <w:numFmt w:val="decimal"/>
       <w:lvlText w:val=""/>
       <w:lvlJc w:val="left"/>
     </w:lvl>
-    <w:lvl w:ilvl="8" w:tplc="09FA12B6">
+    <w:lvl w:ilvl="8" w:tplc="9A3C9688">
       <w:numFmt w:val="decimal"/>
       <w:lvlText w:val=""/>
       <w:lvlJc w:val="left"/>
     </w:lvl>
   </w:abstractNum>
-  <w:abstractNum w:abstractNumId="1" w15:restartNumberingAfterBreak="0">
-    <w:nsid w:val="08E31214"/>
+  <w:abstractNum w:abstractNumId="2" w15:restartNumberingAfterBreak="0">
+    <w:nsid w:val="1B664B62"/>
     <w:multiLevelType w:val="hybridMultilevel"/>
-    <w:tmpl w:val="9962F3E8"/>
-    <w:lvl w:ilvl="0" w:tplc="8DFEEC8A" w:tentative="1">
+    <w:tmpl w:val="591CD8A0"/>
+    <w:lvl w:ilvl="0" w:tplc="2CE4AD02">
+      <w:start w:val="1"/>
+      <w:numFmt w:val="decimal"/>
+      <w:lvlText w:val="%1."/>
+      <w:lvlJc w:val="left"/>
+      <w:pPr>
+        <w:ind w:left="360" w:hanging="300"/>
+      </w:pPr>
+    </w:lvl>
+    <w:lvl w:ilvl="1" w:tplc="A392B1A2" w:tentative="1">
+      <w:start w:val="1"/>
+      <w:numFmt w:val="lowerLetter"/>
+      <w:lvlText w:val="%2."/>
+      <w:lvlJc w:val="left"/>
+      <w:pPr>
+        <w:ind w:left="720" w:hanging="300"/>
+      </w:pPr>
+    </w:lvl>
+    <w:lvl w:ilvl="2" w:tplc="11A8D8F8">
+      <w:numFmt w:val="decimal"/>
+      <w:lvlText w:val=""/>
+      <w:lvlJc w:val="left"/>
+    </w:lvl>
+    <w:lvl w:ilvl="3" w:tplc="1E563F10">
+      <w:numFmt w:val="decimal"/>
+      <w:lvlText w:val=""/>
+      <w:lvlJc w:val="left"/>
+    </w:lvl>
+    <w:lvl w:ilvl="4" w:tplc="D0E0CE7A">
+      <w:numFmt w:val="decimal"/>
+      <w:lvlText w:val=""/>
+      <w:lvlJc w:val="left"/>
+    </w:lvl>
+    <w:lvl w:ilvl="5" w:tplc="AC2EE5AC">
+      <w:numFmt w:val="decimal"/>
+      <w:lvlText w:val=""/>
+      <w:lvlJc w:val="left"/>
+    </w:lvl>
+    <w:lvl w:ilvl="6" w:tplc="829E6A76">
+      <w:numFmt w:val="decimal"/>
+      <w:lvlText w:val=""/>
+      <w:lvlJc w:val="left"/>
+    </w:lvl>
+    <w:lvl w:ilvl="7" w:tplc="C8B454DE">
+      <w:numFmt w:val="decimal"/>
+      <w:lvlText w:val=""/>
+      <w:lvlJc w:val="left"/>
+    </w:lvl>
+    <w:lvl w:ilvl="8" w:tplc="5C0A476E">
+      <w:numFmt w:val="decimal"/>
+      <w:lvlText w:val=""/>
+      <w:lvlJc w:val="left"/>
+    </w:lvl>
+  </w:abstractNum>
+  <w:abstractNum w:abstractNumId="3" w15:restartNumberingAfterBreak="0">
+    <w:nsid w:val="256134F7"/>
+    <w:multiLevelType w:val="hybridMultilevel"/>
+    <w:tmpl w:val="5FA48F12"/>
+    <w:lvl w:ilvl="0" w:tplc="202CA2DC">
+      <w:start w:val="1"/>
+      <w:numFmt w:val="decimal"/>
+      <w:lvlText w:val="%1."/>
+      <w:lvlJc w:val="left"/>
+      <w:pPr>
+        <w:ind w:left="360" w:hanging="300"/>
+      </w:pPr>
+    </w:lvl>
+    <w:lvl w:ilvl="1" w:tplc="67827B90" w:tentative="1">
+      <w:start w:val="1"/>
+      <w:numFmt w:val="lowerLetter"/>
+      <w:lvlText w:val="%2."/>
+      <w:lvlJc w:val="left"/>
+      <w:pPr>
+        <w:ind w:left="720" w:hanging="300"/>
+      </w:pPr>
+    </w:lvl>
+    <w:lvl w:ilvl="2" w:tplc="E16A2382">
+      <w:numFmt w:val="decimal"/>
+      <w:lvlText w:val=""/>
+      <w:lvlJc w:val="left"/>
+    </w:lvl>
+    <w:lvl w:ilvl="3" w:tplc="74AA1214">
+      <w:numFmt w:val="decimal"/>
+      <w:lvlText w:val=""/>
+      <w:lvlJc w:val="left"/>
+    </w:lvl>
+    <w:lvl w:ilvl="4" w:tplc="DB7CBC3C">
+      <w:numFmt w:val="decimal"/>
+      <w:lvlText w:val=""/>
+      <w:lvlJc w:val="left"/>
+    </w:lvl>
+    <w:lvl w:ilvl="5" w:tplc="BD3408EE">
+      <w:numFmt w:val="decimal"/>
+      <w:lvlText w:val=""/>
+      <w:lvlJc w:val="left"/>
+    </w:lvl>
+    <w:lvl w:ilvl="6" w:tplc="F5F6A7DE">
+      <w:numFmt w:val="decimal"/>
+      <w:lvlText w:val=""/>
+      <w:lvlJc w:val="left"/>
+    </w:lvl>
+    <w:lvl w:ilvl="7" w:tplc="8892EB64">
+      <w:numFmt w:val="decimal"/>
+      <w:lvlText w:val=""/>
+      <w:lvlJc w:val="left"/>
+    </w:lvl>
+    <w:lvl w:ilvl="8" w:tplc="09544372">
+      <w:numFmt w:val="decimal"/>
+      <w:lvlText w:val=""/>
+      <w:lvlJc w:val="left"/>
+    </w:lvl>
+  </w:abstractNum>
+  <w:abstractNum w:abstractNumId="4" w15:restartNumberingAfterBreak="0">
+    <w:nsid w:val="2F033F4C"/>
+    <w:multiLevelType w:val="hybridMultilevel"/>
+    <w:tmpl w:val="28B03CA0"/>
+    <w:lvl w:ilvl="0" w:tplc="23643316">
+      <w:start w:val="1"/>
+      <w:numFmt w:val="decimal"/>
+      <w:lvlText w:val="%1."/>
+      <w:lvlJc w:val="left"/>
+      <w:pPr>
+        <w:ind w:left="360" w:hanging="300"/>
+      </w:pPr>
+    </w:lvl>
+    <w:lvl w:ilvl="1" w:tplc="3C3668AA" w:tentative="1">
+      <w:start w:val="1"/>
+      <w:numFmt w:val="lowerLetter"/>
+      <w:lvlText w:val="%2."/>
+      <w:lvlJc w:val="left"/>
+      <w:pPr>
+        <w:ind w:left="720" w:hanging="300"/>
+      </w:pPr>
+    </w:lvl>
+    <w:lvl w:ilvl="2" w:tplc="A01863D0">
+      <w:numFmt w:val="decimal"/>
+      <w:lvlText w:val=""/>
+      <w:lvlJc w:val="left"/>
+    </w:lvl>
+    <w:lvl w:ilvl="3" w:tplc="90ACB214">
+      <w:numFmt w:val="decimal"/>
+      <w:lvlText w:val=""/>
+      <w:lvlJc w:val="left"/>
+    </w:lvl>
+    <w:lvl w:ilvl="4" w:tplc="2F7AD6E2">
+      <w:numFmt w:val="decimal"/>
+      <w:lvlText w:val=""/>
+      <w:lvlJc w:val="left"/>
+    </w:lvl>
+    <w:lvl w:ilvl="5" w:tplc="5DC4A344">
+      <w:numFmt w:val="decimal"/>
+      <w:lvlText w:val=""/>
+      <w:lvlJc w:val="left"/>
+    </w:lvl>
+    <w:lvl w:ilvl="6" w:tplc="D7D0C554">
+      <w:numFmt w:val="decimal"/>
+      <w:lvlText w:val=""/>
+      <w:lvlJc w:val="left"/>
+    </w:lvl>
+    <w:lvl w:ilvl="7" w:tplc="B114CF52">
+      <w:numFmt w:val="decimal"/>
+      <w:lvlText w:val=""/>
+      <w:lvlJc w:val="left"/>
+    </w:lvl>
+    <w:lvl w:ilvl="8" w:tplc="18720EFC">
+      <w:numFmt w:val="decimal"/>
+      <w:lvlText w:val=""/>
+      <w:lvlJc w:val="left"/>
+    </w:lvl>
+  </w:abstractNum>
+  <w:abstractNum w:abstractNumId="5" w15:restartNumberingAfterBreak="0">
+    <w:nsid w:val="44EE20AF"/>
+    <w:multiLevelType w:val="hybridMultilevel"/>
+    <w:tmpl w:val="1A429DAC"/>
+    <w:lvl w:ilvl="0" w:tplc="3940963A">
+      <w:start w:val="1"/>
+      <w:numFmt w:val="decimal"/>
+      <w:lvlText w:val="%1."/>
+      <w:lvlJc w:val="left"/>
+      <w:pPr>
+        <w:ind w:left="360" w:hanging="300"/>
+      </w:pPr>
+    </w:lvl>
+    <w:lvl w:ilvl="1" w:tplc="DAD25614" w:tentative="1">
+      <w:start w:val="1"/>
+      <w:numFmt w:val="lowerLetter"/>
+      <w:lvlText w:val="%2."/>
+      <w:lvlJc w:val="left"/>
+      <w:pPr>
+        <w:ind w:left="720" w:hanging="300"/>
+      </w:pPr>
+    </w:lvl>
+    <w:lvl w:ilvl="2" w:tplc="D9286424">
+      <w:numFmt w:val="decimal"/>
+      <w:lvlText w:val=""/>
+      <w:lvlJc w:val="left"/>
+    </w:lvl>
+    <w:lvl w:ilvl="3" w:tplc="558094A4">
+      <w:numFmt w:val="decimal"/>
+      <w:lvlText w:val=""/>
+      <w:lvlJc w:val="left"/>
+    </w:lvl>
+    <w:lvl w:ilvl="4" w:tplc="D8689D0A">
+      <w:numFmt w:val="decimal"/>
+      <w:lvlText w:val=""/>
+      <w:lvlJc w:val="left"/>
+    </w:lvl>
+    <w:lvl w:ilvl="5" w:tplc="F55A0FE8">
+      <w:numFmt w:val="decimal"/>
+      <w:lvlText w:val=""/>
+      <w:lvlJc w:val="left"/>
+    </w:lvl>
+    <w:lvl w:ilvl="6" w:tplc="75A22988">
+      <w:numFmt w:val="decimal"/>
+      <w:lvlText w:val=""/>
+      <w:lvlJc w:val="left"/>
+    </w:lvl>
+    <w:lvl w:ilvl="7" w:tplc="A170DFE8">
+      <w:numFmt w:val="decimal"/>
+      <w:lvlText w:val=""/>
+      <w:lvlJc w:val="left"/>
+    </w:lvl>
+    <w:lvl w:ilvl="8" w:tplc="89D4F5B2">
+      <w:numFmt w:val="decimal"/>
+      <w:lvlText w:val=""/>
+      <w:lvlJc w:val="left"/>
+    </w:lvl>
+  </w:abstractNum>
+  <w:abstractNum w:abstractNumId="6" w15:restartNumberingAfterBreak="0">
+    <w:nsid w:val="4AFB45A7"/>
+    <w:multiLevelType w:val="hybridMultilevel"/>
+    <w:tmpl w:val="A7448094"/>
+    <w:lvl w:ilvl="0" w:tplc="447A831E">
+      <w:start w:val="1"/>
+      <w:numFmt w:val="decimal"/>
+      <w:lvlText w:val="%1."/>
+      <w:lvlJc w:val="left"/>
+      <w:pPr>
+        <w:ind w:left="360" w:hanging="300"/>
+      </w:pPr>
+    </w:lvl>
+    <w:lvl w:ilvl="1" w:tplc="AD00523C" w:tentative="1">
+      <w:start w:val="1"/>
+      <w:numFmt w:val="lowerLetter"/>
+      <w:lvlText w:val="%2."/>
+      <w:lvlJc w:val="left"/>
+      <w:pPr>
+        <w:ind w:left="720" w:hanging="300"/>
+      </w:pPr>
+    </w:lvl>
+    <w:lvl w:ilvl="2" w:tplc="4C22073C">
+      <w:numFmt w:val="decimal"/>
+      <w:lvlText w:val=""/>
+      <w:lvlJc w:val="left"/>
+    </w:lvl>
+    <w:lvl w:ilvl="3" w:tplc="E334C31E">
+      <w:numFmt w:val="decimal"/>
+      <w:lvlText w:val=""/>
+      <w:lvlJc w:val="left"/>
+    </w:lvl>
+    <w:lvl w:ilvl="4" w:tplc="0690069C">
+      <w:numFmt w:val="decimal"/>
+      <w:lvlText w:val=""/>
+      <w:lvlJc w:val="left"/>
+    </w:lvl>
+    <w:lvl w:ilvl="5" w:tplc="08341610">
+      <w:numFmt w:val="decimal"/>
+      <w:lvlText w:val=""/>
+      <w:lvlJc w:val="left"/>
+    </w:lvl>
+    <w:lvl w:ilvl="6" w:tplc="B68A7702">
+      <w:numFmt w:val="decimal"/>
+      <w:lvlText w:val=""/>
+      <w:lvlJc w:val="left"/>
+    </w:lvl>
+    <w:lvl w:ilvl="7" w:tplc="FF46C9B2">
+      <w:numFmt w:val="decimal"/>
+      <w:lvlText w:val=""/>
+      <w:lvlJc w:val="left"/>
+    </w:lvl>
+    <w:lvl w:ilvl="8" w:tplc="3348C220">
+      <w:numFmt w:val="decimal"/>
+      <w:lvlText w:val=""/>
+      <w:lvlJc w:val="left"/>
+    </w:lvl>
+  </w:abstractNum>
+  <w:abstractNum w:abstractNumId="7" w15:restartNumberingAfterBreak="0">
+    <w:nsid w:val="4EFF44CD"/>
+    <w:multiLevelType w:val="hybridMultilevel"/>
+    <w:tmpl w:val="46D4B6F8"/>
+    <w:lvl w:ilvl="0" w:tplc="E80EDF26">
+      <w:start w:val="1"/>
+      <w:numFmt w:val="decimal"/>
+      <w:lvlText w:val="%1."/>
+      <w:lvlJc w:val="left"/>
+      <w:pPr>
+        <w:ind w:left="360" w:hanging="300"/>
+      </w:pPr>
+    </w:lvl>
+    <w:lvl w:ilvl="1" w:tplc="68249546" w:tentative="1">
+      <w:start w:val="1"/>
+      <w:numFmt w:val="lowerLetter"/>
+      <w:lvlText w:val="%2."/>
+      <w:lvlJc w:val="left"/>
+      <w:pPr>
+        <w:ind w:left="720" w:hanging="300"/>
+      </w:pPr>
+    </w:lvl>
+    <w:lvl w:ilvl="2" w:tplc="36D4B1A2">
+      <w:numFmt w:val="decimal"/>
+      <w:lvlText w:val=""/>
+      <w:lvlJc w:val="left"/>
+    </w:lvl>
+    <w:lvl w:ilvl="3" w:tplc="27069B58">
+      <w:numFmt w:val="decimal"/>
+      <w:lvlText w:val=""/>
+      <w:lvlJc w:val="left"/>
+    </w:lvl>
+    <w:lvl w:ilvl="4" w:tplc="19ECB326">
+      <w:numFmt w:val="decimal"/>
+      <w:lvlText w:val=""/>
+      <w:lvlJc w:val="left"/>
+    </w:lvl>
+    <w:lvl w:ilvl="5" w:tplc="6C2075E4">
+      <w:numFmt w:val="decimal"/>
+      <w:lvlText w:val=""/>
+      <w:lvlJc w:val="left"/>
+    </w:lvl>
+    <w:lvl w:ilvl="6" w:tplc="2C74CE3C">
+      <w:numFmt w:val="decimal"/>
+      <w:lvlText w:val=""/>
+      <w:lvlJc w:val="left"/>
+    </w:lvl>
+    <w:lvl w:ilvl="7" w:tplc="898A16CE">
+      <w:numFmt w:val="decimal"/>
+      <w:lvlText w:val=""/>
+      <w:lvlJc w:val="left"/>
+    </w:lvl>
+    <w:lvl w:ilvl="8" w:tplc="232A6B42">
+      <w:numFmt w:val="decimal"/>
+      <w:lvlText w:val=""/>
+      <w:lvlJc w:val="left"/>
+    </w:lvl>
+  </w:abstractNum>
+  <w:abstractNum w:abstractNumId="8" w15:restartNumberingAfterBreak="0">
+    <w:nsid w:val="54C96A89"/>
+    <w:multiLevelType w:val="hybridMultilevel"/>
+    <w:tmpl w:val="A838F740"/>
+    <w:lvl w:ilvl="0" w:tplc="FFB20258">
+      <w:start w:val="1"/>
+      <w:numFmt w:val="decimal"/>
+      <w:lvlText w:val="%1."/>
+      <w:lvlJc w:val="left"/>
+      <w:pPr>
+        <w:ind w:left="360" w:hanging="300"/>
+      </w:pPr>
+    </w:lvl>
+    <w:lvl w:ilvl="1" w:tplc="6D420BB8" w:tentative="1">
+      <w:start w:val="1"/>
+      <w:numFmt w:val="lowerLetter"/>
+      <w:lvlText w:val="%2."/>
+      <w:lvlJc w:val="left"/>
+      <w:pPr>
+        <w:ind w:left="720" w:hanging="300"/>
+      </w:pPr>
+    </w:lvl>
+    <w:lvl w:ilvl="2" w:tplc="DDD002B8">
+      <w:numFmt w:val="decimal"/>
+      <w:lvlText w:val=""/>
+      <w:lvlJc w:val="left"/>
+    </w:lvl>
+    <w:lvl w:ilvl="3" w:tplc="B8588860">
+      <w:numFmt w:val="decimal"/>
+      <w:lvlText w:val=""/>
+      <w:lvlJc w:val="left"/>
+    </w:lvl>
+    <w:lvl w:ilvl="4" w:tplc="75128E6E">
+      <w:numFmt w:val="decimal"/>
+      <w:lvlText w:val=""/>
+      <w:lvlJc w:val="left"/>
+    </w:lvl>
+    <w:lvl w:ilvl="5" w:tplc="8ACAE282">
+      <w:numFmt w:val="decimal"/>
+      <w:lvlText w:val=""/>
+      <w:lvlJc w:val="left"/>
+    </w:lvl>
+    <w:lvl w:ilvl="6" w:tplc="3B42E350">
+      <w:numFmt w:val="decimal"/>
+      <w:lvlText w:val=""/>
+      <w:lvlJc w:val="left"/>
+    </w:lvl>
+    <w:lvl w:ilvl="7" w:tplc="0052A0C8">
+      <w:numFmt w:val="decimal"/>
+      <w:lvlText w:val=""/>
+      <w:lvlJc w:val="left"/>
+    </w:lvl>
+    <w:lvl w:ilvl="8" w:tplc="AC82A546">
+      <w:numFmt w:val="decimal"/>
+      <w:lvlText w:val=""/>
+      <w:lvlJc w:val="left"/>
+    </w:lvl>
+  </w:abstractNum>
+  <w:abstractNum w:abstractNumId="9" w15:restartNumberingAfterBreak="0">
+    <w:nsid w:val="60B66FE4"/>
+    <w:multiLevelType w:val="hybridMultilevel"/>
+    <w:tmpl w:val="B5029C74"/>
+    <w:lvl w:ilvl="0" w:tplc="9C5260DE">
+      <w:start w:val="1"/>
+      <w:numFmt w:val="decimal"/>
+      <w:lvlText w:val="%1."/>
+      <w:lvlJc w:val="left"/>
+      <w:pPr>
+        <w:ind w:left="360" w:hanging="300"/>
+      </w:pPr>
+    </w:lvl>
+    <w:lvl w:ilvl="1" w:tplc="A1B2D61A" w:tentative="1">
+      <w:start w:val="1"/>
+      <w:numFmt w:val="lowerLetter"/>
+      <w:lvlText w:val="%2."/>
+      <w:lvlJc w:val="left"/>
+      <w:pPr>
+        <w:ind w:left="720" w:hanging="300"/>
+      </w:pPr>
+    </w:lvl>
+    <w:lvl w:ilvl="2" w:tplc="3E38691A">
+      <w:numFmt w:val="decimal"/>
+      <w:lvlText w:val=""/>
+      <w:lvlJc w:val="left"/>
+    </w:lvl>
+    <w:lvl w:ilvl="3" w:tplc="748A3CEC">
+      <w:numFmt w:val="decimal"/>
+      <w:lvlText w:val=""/>
+      <w:lvlJc w:val="left"/>
+    </w:lvl>
+    <w:lvl w:ilvl="4" w:tplc="8A50B87E">
+      <w:numFmt w:val="decimal"/>
+      <w:lvlText w:val=""/>
+      <w:lvlJc w:val="left"/>
+    </w:lvl>
+    <w:lvl w:ilvl="5" w:tplc="643CE33E">
+      <w:numFmt w:val="decimal"/>
+      <w:lvlText w:val=""/>
+      <w:lvlJc w:val="left"/>
+    </w:lvl>
+    <w:lvl w:ilvl="6" w:tplc="7AB6FA76">
+      <w:numFmt w:val="decimal"/>
+      <w:lvlText w:val=""/>
+      <w:lvlJc w:val="left"/>
+    </w:lvl>
+    <w:lvl w:ilvl="7" w:tplc="050030FC">
+      <w:numFmt w:val="decimal"/>
+      <w:lvlText w:val=""/>
+      <w:lvlJc w:val="left"/>
+    </w:lvl>
+    <w:lvl w:ilvl="8" w:tplc="BA945454">
+      <w:numFmt w:val="decimal"/>
+      <w:lvlText w:val=""/>
+      <w:lvlJc w:val="left"/>
+    </w:lvl>
+  </w:abstractNum>
+  <w:abstractNum w:abstractNumId="10" w15:restartNumberingAfterBreak="0">
+    <w:nsid w:val="6748708B"/>
+    <w:multiLevelType w:val="hybridMultilevel"/>
+    <w:tmpl w:val="B72462BE"/>
+    <w:lvl w:ilvl="0" w:tplc="A8C4F9EA" w:tentative="1">
       <w:start w:val="1"/>
       <w:numFmt w:val="bullet"/>
       <w:lvlText w:val="●"/>
@@ -7160,7 +7816,7 @@
         <w:ind w:left="720" w:hanging="360"/>
       </w:pPr>
     </w:lvl>
-    <w:lvl w:ilvl="1" w:tplc="2A1E17E0" w:tentative="1">
+    <w:lvl w:ilvl="1" w:tplc="0A5A60A2" w:tentative="1">
       <w:start w:val="1"/>
       <w:numFmt w:val="bullet"/>
       <w:lvlText w:val="○"/>
@@ -7169,7 +7825,7 @@
         <w:ind w:left="1440" w:hanging="360"/>
       </w:pPr>
     </w:lvl>
-    <w:lvl w:ilvl="2" w:tplc="54E07120" w:tentative="1">
+    <w:lvl w:ilvl="2" w:tplc="79FC4142" w:tentative="1">
       <w:start w:val="1"/>
       <w:numFmt w:val="bullet"/>
       <w:lvlText w:val="■"/>
@@ -7178,7 +7834,7 @@
         <w:ind w:left="2160" w:hanging="360"/>
       </w:pPr>
     </w:lvl>
-    <w:lvl w:ilvl="3" w:tplc="5B10FD50" w:tentative="1">
+    <w:lvl w:ilvl="3" w:tplc="E3A2754C" w:tentative="1">
       <w:start w:val="1"/>
       <w:numFmt w:val="bullet"/>
       <w:lvlText w:val="●"/>
@@ -7187,7 +7843,7 @@
         <w:ind w:left="2880" w:hanging="360"/>
       </w:pPr>
     </w:lvl>
-    <w:lvl w:ilvl="4" w:tplc="8A2C1B78" w:tentative="1">
+    <w:lvl w:ilvl="4" w:tplc="52785DEA" w:tentative="1">
       <w:start w:val="1"/>
       <w:numFmt w:val="bullet"/>
       <w:lvlText w:val="○"/>
@@ -7196,7 +7852,7 @@
         <w:ind w:left="3600" w:hanging="360"/>
       </w:pPr>
     </w:lvl>
-    <w:lvl w:ilvl="5" w:tplc="4F221FDC" w:tentative="1">
+    <w:lvl w:ilvl="5" w:tplc="5AE22D34" w:tentative="1">
       <w:start w:val="1"/>
       <w:numFmt w:val="bullet"/>
       <w:lvlText w:val="■"/>
@@ -7205,7 +7861,7 @@
         <w:ind w:left="4320" w:hanging="360"/>
       </w:pPr>
     </w:lvl>
-    <w:lvl w:ilvl="6" w:tplc="9C0CED74" w:tentative="1">
+    <w:lvl w:ilvl="6" w:tplc="83C6A15A" w:tentative="1">
       <w:start w:val="1"/>
       <w:numFmt w:val="bullet"/>
       <w:lvlText w:val="●"/>
@@ -7214,7 +7870,7 @@
         <w:ind w:left="5040" w:hanging="360"/>
       </w:pPr>
     </w:lvl>
-    <w:lvl w:ilvl="7" w:tplc="256E6058" w:tentative="1">
+    <w:lvl w:ilvl="7" w:tplc="A9385740" w:tentative="1">
       <w:start w:val="1"/>
       <w:numFmt w:val="bullet"/>
       <w:lvlText w:val="●"/>
@@ -7223,7 +7879,7 @@
         <w:ind w:left="5760" w:hanging="360"/>
       </w:pPr>
     </w:lvl>
-    <w:lvl w:ilvl="8" w:tplc="AE34AEE6" w:tentative="1">
+    <w:lvl w:ilvl="8" w:tplc="8C4839B6" w:tentative="1">
       <w:start w:val="1"/>
       <w:numFmt w:val="bullet"/>
       <w:lvlText w:val="●"/>
@@ -7233,584 +7889,62 @@
       </w:pPr>
     </w:lvl>
   </w:abstractNum>
-  <w:abstractNum w:abstractNumId="2" w15:restartNumberingAfterBreak="0">
-    <w:nsid w:val="0DF81E9D"/>
-    <w:multiLevelType w:val="hybridMultilevel"/>
-    <w:tmpl w:val="46D60ED6"/>
-    <w:lvl w:ilvl="0" w:tplc="934AE1D8" w:tentative="1">
-      <w:start w:val="1"/>
-      <w:numFmt w:val="bullet"/>
-      <w:lvlText w:val="•"/>
-      <w:lvlJc w:val="left"/>
-      <w:pPr>
-        <w:ind w:left="360" w:hanging="260"/>
-      </w:pPr>
-    </w:lvl>
-    <w:lvl w:ilvl="1" w:tplc="D1DA1228" w:tentative="1">
-      <w:start w:val="1"/>
-      <w:numFmt w:val="bullet"/>
-      <w:lvlText w:val="–"/>
-      <w:lvlJc w:val="left"/>
-      <w:pPr>
-        <w:ind w:left="720" w:hanging="260"/>
-      </w:pPr>
-    </w:lvl>
-    <w:lvl w:ilvl="2" w:tplc="EE0E15CC">
-      <w:numFmt w:val="decimal"/>
-      <w:lvlText w:val=""/>
-      <w:lvlJc w:val="left"/>
-    </w:lvl>
-    <w:lvl w:ilvl="3" w:tplc="7368D154">
-      <w:numFmt w:val="decimal"/>
-      <w:lvlText w:val=""/>
-      <w:lvlJc w:val="left"/>
-    </w:lvl>
-    <w:lvl w:ilvl="4" w:tplc="2F50696C">
-      <w:numFmt w:val="decimal"/>
-      <w:lvlText w:val=""/>
-      <w:lvlJc w:val="left"/>
-    </w:lvl>
-    <w:lvl w:ilvl="5" w:tplc="E668B9C2">
-      <w:numFmt w:val="decimal"/>
-      <w:lvlText w:val=""/>
-      <w:lvlJc w:val="left"/>
-    </w:lvl>
-    <w:lvl w:ilvl="6" w:tplc="BEE0488E">
-      <w:numFmt w:val="decimal"/>
-      <w:lvlText w:val=""/>
-      <w:lvlJc w:val="left"/>
-    </w:lvl>
-    <w:lvl w:ilvl="7" w:tplc="F080F28C">
-      <w:numFmt w:val="decimal"/>
-      <w:lvlText w:val=""/>
-      <w:lvlJc w:val="left"/>
-    </w:lvl>
-    <w:lvl w:ilvl="8" w:tplc="70C0F5D2">
-      <w:numFmt w:val="decimal"/>
-      <w:lvlText w:val=""/>
-      <w:lvlJc w:val="left"/>
-    </w:lvl>
-  </w:abstractNum>
-  <w:abstractNum w:abstractNumId="3" w15:restartNumberingAfterBreak="0">
-    <w:nsid w:val="161C5EA9"/>
-    <w:multiLevelType w:val="hybridMultilevel"/>
-    <w:tmpl w:val="A912C4AC"/>
-    <w:lvl w:ilvl="0" w:tplc="7F9AA26A">
-      <w:start w:val="1"/>
-      <w:numFmt w:val="decimal"/>
-      <w:lvlText w:val="%1."/>
-      <w:lvlJc w:val="left"/>
-      <w:pPr>
-        <w:ind w:left="360" w:hanging="300"/>
-      </w:pPr>
-    </w:lvl>
-    <w:lvl w:ilvl="1" w:tplc="3B28D044" w:tentative="1">
-      <w:start w:val="1"/>
-      <w:numFmt w:val="lowerLetter"/>
-      <w:lvlText w:val="%2."/>
-      <w:lvlJc w:val="left"/>
-      <w:pPr>
-        <w:ind w:left="720" w:hanging="300"/>
-      </w:pPr>
-    </w:lvl>
-    <w:lvl w:ilvl="2" w:tplc="44C48C42">
-      <w:numFmt w:val="decimal"/>
-      <w:lvlText w:val=""/>
-      <w:lvlJc w:val="left"/>
-    </w:lvl>
-    <w:lvl w:ilvl="3" w:tplc="4E408148">
-      <w:numFmt w:val="decimal"/>
-      <w:lvlText w:val=""/>
-      <w:lvlJc w:val="left"/>
-    </w:lvl>
-    <w:lvl w:ilvl="4" w:tplc="49F0E440">
-      <w:numFmt w:val="decimal"/>
-      <w:lvlText w:val=""/>
-      <w:lvlJc w:val="left"/>
-    </w:lvl>
-    <w:lvl w:ilvl="5" w:tplc="0E24C83A">
-      <w:numFmt w:val="decimal"/>
-      <w:lvlText w:val=""/>
-      <w:lvlJc w:val="left"/>
-    </w:lvl>
-    <w:lvl w:ilvl="6" w:tplc="0AACD054">
-      <w:numFmt w:val="decimal"/>
-      <w:lvlText w:val=""/>
-      <w:lvlJc w:val="left"/>
-    </w:lvl>
-    <w:lvl w:ilvl="7" w:tplc="AFD653F2">
-      <w:numFmt w:val="decimal"/>
-      <w:lvlText w:val=""/>
-      <w:lvlJc w:val="left"/>
-    </w:lvl>
-    <w:lvl w:ilvl="8" w:tplc="C46AA5D6">
-      <w:numFmt w:val="decimal"/>
-      <w:lvlText w:val=""/>
-      <w:lvlJc w:val="left"/>
-    </w:lvl>
-  </w:abstractNum>
-  <w:abstractNum w:abstractNumId="4" w15:restartNumberingAfterBreak="0">
-    <w:nsid w:val="1C7435B9"/>
-    <w:multiLevelType w:val="hybridMultilevel"/>
-    <w:tmpl w:val="771AAE88"/>
-    <w:lvl w:ilvl="0" w:tplc="4672F1BE">
-      <w:start w:val="1"/>
-      <w:numFmt w:val="decimal"/>
-      <w:lvlText w:val="%1."/>
-      <w:lvlJc w:val="left"/>
-      <w:pPr>
-        <w:ind w:left="360" w:hanging="300"/>
-      </w:pPr>
-    </w:lvl>
-    <w:lvl w:ilvl="1" w:tplc="B4363212" w:tentative="1">
-      <w:start w:val="1"/>
-      <w:numFmt w:val="lowerLetter"/>
-      <w:lvlText w:val="%2."/>
-      <w:lvlJc w:val="left"/>
-      <w:pPr>
-        <w:ind w:left="720" w:hanging="300"/>
-      </w:pPr>
-    </w:lvl>
-    <w:lvl w:ilvl="2" w:tplc="520AE432">
-      <w:numFmt w:val="decimal"/>
-      <w:lvlText w:val=""/>
-      <w:lvlJc w:val="left"/>
-    </w:lvl>
-    <w:lvl w:ilvl="3" w:tplc="D6F645FA">
-      <w:numFmt w:val="decimal"/>
-      <w:lvlText w:val=""/>
-      <w:lvlJc w:val="left"/>
-    </w:lvl>
-    <w:lvl w:ilvl="4" w:tplc="0434893E">
-      <w:numFmt w:val="decimal"/>
-      <w:lvlText w:val=""/>
-      <w:lvlJc w:val="left"/>
-    </w:lvl>
-    <w:lvl w:ilvl="5" w:tplc="73EA546E">
-      <w:numFmt w:val="decimal"/>
-      <w:lvlText w:val=""/>
-      <w:lvlJc w:val="left"/>
-    </w:lvl>
-    <w:lvl w:ilvl="6" w:tplc="7728B9A2">
-      <w:numFmt w:val="decimal"/>
-      <w:lvlText w:val=""/>
-      <w:lvlJc w:val="left"/>
-    </w:lvl>
-    <w:lvl w:ilvl="7" w:tplc="04D23EDA">
-      <w:numFmt w:val="decimal"/>
-      <w:lvlText w:val=""/>
-      <w:lvlJc w:val="left"/>
-    </w:lvl>
-    <w:lvl w:ilvl="8" w:tplc="C484B59C">
-      <w:numFmt w:val="decimal"/>
-      <w:lvlText w:val=""/>
-      <w:lvlJc w:val="left"/>
-    </w:lvl>
-  </w:abstractNum>
-  <w:abstractNum w:abstractNumId="5" w15:restartNumberingAfterBreak="0">
-    <w:nsid w:val="1F081AC3"/>
-    <w:multiLevelType w:val="hybridMultilevel"/>
-    <w:tmpl w:val="C5D2870A"/>
-    <w:lvl w:ilvl="0" w:tplc="ED5EBBFE">
-      <w:start w:val="1"/>
-      <w:numFmt w:val="decimal"/>
-      <w:lvlText w:val="%1."/>
-      <w:lvlJc w:val="left"/>
-      <w:pPr>
-        <w:ind w:left="360" w:hanging="300"/>
-      </w:pPr>
-    </w:lvl>
-    <w:lvl w:ilvl="1" w:tplc="72C442E0" w:tentative="1">
-      <w:start w:val="1"/>
-      <w:numFmt w:val="lowerLetter"/>
-      <w:lvlText w:val="%2."/>
-      <w:lvlJc w:val="left"/>
-      <w:pPr>
-        <w:ind w:left="720" w:hanging="300"/>
-      </w:pPr>
-    </w:lvl>
-    <w:lvl w:ilvl="2" w:tplc="F8D47B62">
-      <w:numFmt w:val="decimal"/>
-      <w:lvlText w:val=""/>
-      <w:lvlJc w:val="left"/>
-    </w:lvl>
-    <w:lvl w:ilvl="3" w:tplc="D52EC126">
-      <w:numFmt w:val="decimal"/>
-      <w:lvlText w:val=""/>
-      <w:lvlJc w:val="left"/>
-    </w:lvl>
-    <w:lvl w:ilvl="4" w:tplc="715C39C2">
-      <w:numFmt w:val="decimal"/>
-      <w:lvlText w:val=""/>
-      <w:lvlJc w:val="left"/>
-    </w:lvl>
-    <w:lvl w:ilvl="5" w:tplc="504CD8D2">
-      <w:numFmt w:val="decimal"/>
-      <w:lvlText w:val=""/>
-      <w:lvlJc w:val="left"/>
-    </w:lvl>
-    <w:lvl w:ilvl="6" w:tplc="8392F268">
-      <w:numFmt w:val="decimal"/>
-      <w:lvlText w:val=""/>
-      <w:lvlJc w:val="left"/>
-    </w:lvl>
-    <w:lvl w:ilvl="7" w:tplc="1FDA3616">
-      <w:numFmt w:val="decimal"/>
-      <w:lvlText w:val=""/>
-      <w:lvlJc w:val="left"/>
-    </w:lvl>
-    <w:lvl w:ilvl="8" w:tplc="7B2A7AFC">
-      <w:numFmt w:val="decimal"/>
-      <w:lvlText w:val=""/>
-      <w:lvlJc w:val="left"/>
-    </w:lvl>
-  </w:abstractNum>
-  <w:abstractNum w:abstractNumId="6" w15:restartNumberingAfterBreak="0">
-    <w:nsid w:val="33D23A62"/>
-    <w:multiLevelType w:val="hybridMultilevel"/>
-    <w:tmpl w:val="116002BE"/>
-    <w:lvl w:ilvl="0" w:tplc="7A708516">
-      <w:start w:val="1"/>
-      <w:numFmt w:val="decimal"/>
-      <w:lvlText w:val="%1."/>
-      <w:lvlJc w:val="left"/>
-      <w:pPr>
-        <w:ind w:left="360" w:hanging="300"/>
-      </w:pPr>
-    </w:lvl>
-    <w:lvl w:ilvl="1" w:tplc="469A17AE" w:tentative="1">
-      <w:start w:val="1"/>
-      <w:numFmt w:val="lowerLetter"/>
-      <w:lvlText w:val="%2."/>
-      <w:lvlJc w:val="left"/>
-      <w:pPr>
-        <w:ind w:left="720" w:hanging="300"/>
-      </w:pPr>
-    </w:lvl>
-    <w:lvl w:ilvl="2" w:tplc="AD926C7C">
-      <w:numFmt w:val="decimal"/>
-      <w:lvlText w:val=""/>
-      <w:lvlJc w:val="left"/>
-    </w:lvl>
-    <w:lvl w:ilvl="3" w:tplc="418ADFCE">
-      <w:numFmt w:val="decimal"/>
-      <w:lvlText w:val=""/>
-      <w:lvlJc w:val="left"/>
-    </w:lvl>
-    <w:lvl w:ilvl="4" w:tplc="83106522">
-      <w:numFmt w:val="decimal"/>
-      <w:lvlText w:val=""/>
-      <w:lvlJc w:val="left"/>
-    </w:lvl>
-    <w:lvl w:ilvl="5" w:tplc="69C05C34">
-      <w:numFmt w:val="decimal"/>
-      <w:lvlText w:val=""/>
-      <w:lvlJc w:val="left"/>
-    </w:lvl>
-    <w:lvl w:ilvl="6" w:tplc="CDAE12F8">
-      <w:numFmt w:val="decimal"/>
-      <w:lvlText w:val=""/>
-      <w:lvlJc w:val="left"/>
-    </w:lvl>
-    <w:lvl w:ilvl="7" w:tplc="10F8485C">
-      <w:numFmt w:val="decimal"/>
-      <w:lvlText w:val=""/>
-      <w:lvlJc w:val="left"/>
-    </w:lvl>
-    <w:lvl w:ilvl="8" w:tplc="40CC580E">
-      <w:numFmt w:val="decimal"/>
-      <w:lvlText w:val=""/>
-      <w:lvlJc w:val="left"/>
-    </w:lvl>
-  </w:abstractNum>
-  <w:abstractNum w:abstractNumId="7" w15:restartNumberingAfterBreak="0">
-    <w:nsid w:val="37382DF5"/>
-    <w:multiLevelType w:val="hybridMultilevel"/>
-    <w:tmpl w:val="BD8AE54A"/>
-    <w:lvl w:ilvl="0" w:tplc="0874AACA">
-      <w:start w:val="1"/>
-      <w:numFmt w:val="decimal"/>
-      <w:lvlText w:val="%1."/>
-      <w:lvlJc w:val="left"/>
-      <w:pPr>
-        <w:ind w:left="360" w:hanging="300"/>
-      </w:pPr>
-    </w:lvl>
-    <w:lvl w:ilvl="1" w:tplc="AFC4637E" w:tentative="1">
-      <w:start w:val="1"/>
-      <w:numFmt w:val="lowerLetter"/>
-      <w:lvlText w:val="%2."/>
-      <w:lvlJc w:val="left"/>
-      <w:pPr>
-        <w:ind w:left="720" w:hanging="300"/>
-      </w:pPr>
-    </w:lvl>
-    <w:lvl w:ilvl="2" w:tplc="38D48ED6">
-      <w:numFmt w:val="decimal"/>
-      <w:lvlText w:val=""/>
-      <w:lvlJc w:val="left"/>
-    </w:lvl>
-    <w:lvl w:ilvl="3" w:tplc="54B86DF8">
-      <w:numFmt w:val="decimal"/>
-      <w:lvlText w:val=""/>
-      <w:lvlJc w:val="left"/>
-    </w:lvl>
-    <w:lvl w:ilvl="4" w:tplc="32C03BC8">
-      <w:numFmt w:val="decimal"/>
-      <w:lvlText w:val=""/>
-      <w:lvlJc w:val="left"/>
-    </w:lvl>
-    <w:lvl w:ilvl="5" w:tplc="F1249124">
-      <w:numFmt w:val="decimal"/>
-      <w:lvlText w:val=""/>
-      <w:lvlJc w:val="left"/>
-    </w:lvl>
-    <w:lvl w:ilvl="6" w:tplc="87C03B7A">
-      <w:numFmt w:val="decimal"/>
-      <w:lvlText w:val=""/>
-      <w:lvlJc w:val="left"/>
-    </w:lvl>
-    <w:lvl w:ilvl="7" w:tplc="275AFAF6">
-      <w:numFmt w:val="decimal"/>
-      <w:lvlText w:val=""/>
-      <w:lvlJc w:val="left"/>
-    </w:lvl>
-    <w:lvl w:ilvl="8" w:tplc="41A48EDE">
-      <w:numFmt w:val="decimal"/>
-      <w:lvlText w:val=""/>
-      <w:lvlJc w:val="left"/>
-    </w:lvl>
-  </w:abstractNum>
-  <w:abstractNum w:abstractNumId="8" w15:restartNumberingAfterBreak="0">
-    <w:nsid w:val="51BE1AD4"/>
-    <w:multiLevelType w:val="hybridMultilevel"/>
-    <w:tmpl w:val="F648D374"/>
-    <w:lvl w:ilvl="0" w:tplc="8CC61B1C">
-      <w:start w:val="1"/>
-      <w:numFmt w:val="decimal"/>
-      <w:lvlText w:val="%1."/>
-      <w:lvlJc w:val="left"/>
-      <w:pPr>
-        <w:ind w:left="360" w:hanging="300"/>
-      </w:pPr>
-    </w:lvl>
-    <w:lvl w:ilvl="1" w:tplc="49CC8B92" w:tentative="1">
-      <w:start w:val="1"/>
-      <w:numFmt w:val="lowerLetter"/>
-      <w:lvlText w:val="%2."/>
-      <w:lvlJc w:val="left"/>
-      <w:pPr>
-        <w:ind w:left="720" w:hanging="300"/>
-      </w:pPr>
-    </w:lvl>
-    <w:lvl w:ilvl="2" w:tplc="EC72863A">
-      <w:numFmt w:val="decimal"/>
-      <w:lvlText w:val=""/>
-      <w:lvlJc w:val="left"/>
-    </w:lvl>
-    <w:lvl w:ilvl="3" w:tplc="CA441F30">
-      <w:numFmt w:val="decimal"/>
-      <w:lvlText w:val=""/>
-      <w:lvlJc w:val="left"/>
-    </w:lvl>
-    <w:lvl w:ilvl="4" w:tplc="C1F8C0BE">
-      <w:numFmt w:val="decimal"/>
-      <w:lvlText w:val=""/>
-      <w:lvlJc w:val="left"/>
-    </w:lvl>
-    <w:lvl w:ilvl="5" w:tplc="C23AE0BC">
-      <w:numFmt w:val="decimal"/>
-      <w:lvlText w:val=""/>
-      <w:lvlJc w:val="left"/>
-    </w:lvl>
-    <w:lvl w:ilvl="6" w:tplc="28827D8C">
-      <w:numFmt w:val="decimal"/>
-      <w:lvlText w:val=""/>
-      <w:lvlJc w:val="left"/>
-    </w:lvl>
-    <w:lvl w:ilvl="7" w:tplc="EC040848">
-      <w:numFmt w:val="decimal"/>
-      <w:lvlText w:val=""/>
-      <w:lvlJc w:val="left"/>
-    </w:lvl>
-    <w:lvl w:ilvl="8" w:tplc="12B4C476">
-      <w:numFmt w:val="decimal"/>
-      <w:lvlText w:val=""/>
-      <w:lvlJc w:val="left"/>
-    </w:lvl>
-  </w:abstractNum>
-  <w:abstractNum w:abstractNumId="9" w15:restartNumberingAfterBreak="0">
-    <w:nsid w:val="6EF90C5B"/>
-    <w:multiLevelType w:val="hybridMultilevel"/>
-    <w:tmpl w:val="7C2C3464"/>
-    <w:lvl w:ilvl="0" w:tplc="49688F1C">
-      <w:start w:val="1"/>
-      <w:numFmt w:val="decimal"/>
-      <w:lvlText w:val="%1."/>
-      <w:lvlJc w:val="left"/>
-      <w:pPr>
-        <w:ind w:left="360" w:hanging="300"/>
-      </w:pPr>
-    </w:lvl>
-    <w:lvl w:ilvl="1" w:tplc="C2560F5E" w:tentative="1">
-      <w:start w:val="1"/>
-      <w:numFmt w:val="lowerLetter"/>
-      <w:lvlText w:val="%2."/>
-      <w:lvlJc w:val="left"/>
-      <w:pPr>
-        <w:ind w:left="720" w:hanging="300"/>
-      </w:pPr>
-    </w:lvl>
-    <w:lvl w:ilvl="2" w:tplc="E50A43B8">
-      <w:numFmt w:val="decimal"/>
-      <w:lvlText w:val=""/>
-      <w:lvlJc w:val="left"/>
-    </w:lvl>
-    <w:lvl w:ilvl="3" w:tplc="50683060">
-      <w:numFmt w:val="decimal"/>
-      <w:lvlText w:val=""/>
-      <w:lvlJc w:val="left"/>
-    </w:lvl>
-    <w:lvl w:ilvl="4" w:tplc="4B3221FA">
-      <w:numFmt w:val="decimal"/>
-      <w:lvlText w:val=""/>
-      <w:lvlJc w:val="left"/>
-    </w:lvl>
-    <w:lvl w:ilvl="5" w:tplc="BF12AE4C">
-      <w:numFmt w:val="decimal"/>
-      <w:lvlText w:val=""/>
-      <w:lvlJc w:val="left"/>
-    </w:lvl>
-    <w:lvl w:ilvl="6" w:tplc="25F458A6">
-      <w:numFmt w:val="decimal"/>
-      <w:lvlText w:val=""/>
-      <w:lvlJc w:val="left"/>
-    </w:lvl>
-    <w:lvl w:ilvl="7" w:tplc="2A0C68CE">
-      <w:numFmt w:val="decimal"/>
-      <w:lvlText w:val=""/>
-      <w:lvlJc w:val="left"/>
-    </w:lvl>
-    <w:lvl w:ilvl="8" w:tplc="147881D8">
-      <w:numFmt w:val="decimal"/>
-      <w:lvlText w:val=""/>
-      <w:lvlJc w:val="left"/>
-    </w:lvl>
-  </w:abstractNum>
-  <w:abstractNum w:abstractNumId="10" w15:restartNumberingAfterBreak="0">
-    <w:nsid w:val="6F526E6F"/>
-    <w:multiLevelType w:val="hybridMultilevel"/>
-    <w:tmpl w:val="AACAA2E6"/>
-    <w:lvl w:ilvl="0" w:tplc="CBD0A1E0">
-      <w:start w:val="1"/>
-      <w:numFmt w:val="decimal"/>
-      <w:lvlText w:val="%1."/>
-      <w:lvlJc w:val="left"/>
-      <w:pPr>
-        <w:ind w:left="360" w:hanging="300"/>
-      </w:pPr>
-    </w:lvl>
-    <w:lvl w:ilvl="1" w:tplc="B764107C" w:tentative="1">
-      <w:start w:val="1"/>
-      <w:numFmt w:val="lowerLetter"/>
-      <w:lvlText w:val="%2."/>
-      <w:lvlJc w:val="left"/>
-      <w:pPr>
-        <w:ind w:left="720" w:hanging="300"/>
-      </w:pPr>
-    </w:lvl>
-    <w:lvl w:ilvl="2" w:tplc="DBEC96C2">
-      <w:numFmt w:val="decimal"/>
-      <w:lvlText w:val=""/>
-      <w:lvlJc w:val="left"/>
-    </w:lvl>
-    <w:lvl w:ilvl="3" w:tplc="F8AA2174">
-      <w:numFmt w:val="decimal"/>
-      <w:lvlText w:val=""/>
-      <w:lvlJc w:val="left"/>
-    </w:lvl>
-    <w:lvl w:ilvl="4" w:tplc="CE1CC420">
-      <w:numFmt w:val="decimal"/>
-      <w:lvlText w:val=""/>
-      <w:lvlJc w:val="left"/>
-    </w:lvl>
-    <w:lvl w:ilvl="5" w:tplc="88B87576">
-      <w:numFmt w:val="decimal"/>
-      <w:lvlText w:val=""/>
-      <w:lvlJc w:val="left"/>
-    </w:lvl>
-    <w:lvl w:ilvl="6" w:tplc="91F2753C">
-      <w:numFmt w:val="decimal"/>
-      <w:lvlText w:val=""/>
-      <w:lvlJc w:val="left"/>
-    </w:lvl>
-    <w:lvl w:ilvl="7" w:tplc="EC8EC55A">
-      <w:numFmt w:val="decimal"/>
-      <w:lvlText w:val=""/>
-      <w:lvlJc w:val="left"/>
-    </w:lvl>
-    <w:lvl w:ilvl="8" w:tplc="C88AD000">
-      <w:numFmt w:val="decimal"/>
-      <w:lvlText w:val=""/>
-      <w:lvlJc w:val="left"/>
-    </w:lvl>
-  </w:abstractNum>
-  <w:num w:numId="1" w16cid:durableId="1398475247">
+  <w:num w:numId="1" w16cid:durableId="1371565123">
+    <w:abstractNumId w:val="10"/>
+    <w:lvlOverride w:ilvl="0">
+      <w:startOverride w:val="1"/>
+    </w:lvlOverride>
+  </w:num>
+  <w:num w:numId="2" w16cid:durableId="1149244766">
     <w:abstractNumId w:val="1"/>
     <w:lvlOverride w:ilvl="0">
       <w:startOverride w:val="1"/>
     </w:lvlOverride>
   </w:num>
-  <w:num w:numId="2" w16cid:durableId="2015565839">
+  <w:num w:numId="3" w16cid:durableId="138771646">
     <w:abstractNumId w:val="7"/>
     <w:lvlOverride w:ilvl="0">
       <w:startOverride w:val="1"/>
     </w:lvlOverride>
   </w:num>
-  <w:num w:numId="3" w16cid:durableId="700977837">
+  <w:num w:numId="4" w16cid:durableId="312367896">
+    <w:abstractNumId w:val="6"/>
+    <w:lvlOverride w:ilvl="0">
+      <w:startOverride w:val="1"/>
+    </w:lvlOverride>
+  </w:num>
+  <w:num w:numId="5" w16cid:durableId="1039866151">
+    <w:abstractNumId w:val="3"/>
+    <w:lvlOverride w:ilvl="0">
+      <w:startOverride w:val="1"/>
+    </w:lvlOverride>
+  </w:num>
+  <w:num w:numId="6" w16cid:durableId="767776468">
     <w:abstractNumId w:val="8"/>
     <w:lvlOverride w:ilvl="0">
       <w:startOverride w:val="1"/>
     </w:lvlOverride>
   </w:num>
-  <w:num w:numId="4" w16cid:durableId="144274258">
+  <w:num w:numId="7" w16cid:durableId="224340394">
     <w:abstractNumId w:val="9"/>
     <w:lvlOverride w:ilvl="0">
       <w:startOverride w:val="1"/>
     </w:lvlOverride>
   </w:num>
-  <w:num w:numId="5" w16cid:durableId="2074423927">
-    <w:abstractNumId w:val="3"/>
+  <w:num w:numId="8" w16cid:durableId="1881356340">
+    <w:abstractNumId w:val="2"/>
     <w:lvlOverride w:ilvl="0">
       <w:startOverride w:val="1"/>
     </w:lvlOverride>
   </w:num>
-  <w:num w:numId="6" w16cid:durableId="2101556256">
-    <w:abstractNumId w:val="4"/>
-    <w:lvlOverride w:ilvl="0">
-      <w:startOverride w:val="1"/>
-    </w:lvlOverride>
-  </w:num>
-  <w:num w:numId="7" w16cid:durableId="446585486">
+  <w:num w:numId="9" w16cid:durableId="1894997373">
     <w:abstractNumId w:val="5"/>
     <w:lvlOverride w:ilvl="0">
       <w:startOverride w:val="1"/>
     </w:lvlOverride>
   </w:num>
-  <w:num w:numId="8" w16cid:durableId="1130441762">
-    <w:abstractNumId w:val="0"/>
-    <w:lvlOverride w:ilvl="0">
-      <w:startOverride w:val="1"/>
-    </w:lvlOverride>
-  </w:num>
-  <w:num w:numId="9" w16cid:durableId="153497118">
-    <w:abstractNumId w:val="6"/>
-    <w:lvlOverride w:ilvl="0">
-      <w:startOverride w:val="1"/>
-    </w:lvlOverride>
-  </w:num>
-  <w:num w:numId="10" w16cid:durableId="648948536">
-    <w:abstractNumId w:val="10"/>
+  <w:num w:numId="10" w16cid:durableId="438910598">
+    <w:abstractNumId w:val="4"/>
     <w:lvlOverride w:ilvl="0">
       <w:startOverride w:val="1"/>
     </w:lvlOverride>
@@ -8491,7 +8625,7 @@
     <w:autoRedefine/>
     <w:uiPriority w:val="39"/>
     <w:unhideWhenUsed/>
-    <w:rsid w:val="00914D3E"/>
+    <w:rsid w:val="001855FF"/>
     <w:pPr>
       <w:spacing w:after="100"/>
     </w:pPr>

</xml_diff>